<commit_message>
i add some files of my homewors
</commit_message>
<xml_diff>
--- a/WDD330/W1/wdd330-professional-development.docx
+++ b/WDD330/W1/wdd330-professional-development.docx
@@ -263,15 +263,15 @@
         <w:tblLook w:val="04a0" w:noHBand="0" w:noVBand="1" w:firstColumn="1" w:lastRow="0" w:lastColumn="0" w:firstRow="1"/>
       </w:tblPr>
       <w:tblGrid>
-        <w:gridCol w:w="960"/>
+        <w:gridCol w:w="959"/>
         <w:gridCol w:w="1711"/>
-        <w:gridCol w:w="5720"/>
+        <w:gridCol w:w="5721"/>
       </w:tblGrid>
       <w:tr>
         <w:trPr/>
         <w:tc>
           <w:tcPr>
-            <w:tcW w:w="960" w:type="dxa"/>
+            <w:tcW w:w="959" w:type="dxa"/>
             <w:tcBorders/>
             <w:shd w:color="auto" w:fill="000000" w:themeFill="text1" w:val="clear"/>
           </w:tcPr>
@@ -279,6 +279,7 @@
             <w:pPr>
               <w:pStyle w:val="NoSpacing"/>
               <w:widowControl/>
+              <w:suppressAutoHyphens w:val="true"/>
               <w:spacing w:before="0" w:after="0"/>
               <w:jc w:val="center"/>
               <w:rPr>
@@ -315,6 +316,7 @@
             <w:pPr>
               <w:pStyle w:val="NoSpacing"/>
               <w:widowControl/>
+              <w:suppressAutoHyphens w:val="true"/>
               <w:spacing w:before="0" w:after="0"/>
               <w:jc w:val="center"/>
               <w:rPr>
@@ -342,7 +344,7 @@
         </w:tc>
         <w:tc>
           <w:tcPr>
-            <w:tcW w:w="5720" w:type="dxa"/>
+            <w:tcW w:w="5721" w:type="dxa"/>
             <w:tcBorders/>
             <w:shd w:color="auto" w:fill="000000" w:themeFill="text1" w:val="clear"/>
             <w:vAlign w:val="bottom"/>
@@ -351,6 +353,7 @@
             <w:pPr>
               <w:pStyle w:val="NoSpacing"/>
               <w:widowControl/>
+              <w:suppressAutoHyphens w:val="true"/>
               <w:spacing w:before="0" w:after="0"/>
               <w:jc w:val="center"/>
               <w:rPr>
@@ -383,7 +386,7 @@
         </w:trPr>
         <w:tc>
           <w:tcPr>
-            <w:tcW w:w="960" w:type="dxa"/>
+            <w:tcW w:w="959" w:type="dxa"/>
             <w:tcBorders/>
             <w:vAlign w:val="center"/>
           </w:tcPr>
@@ -391,6 +394,7 @@
             <w:pPr>
               <w:pStyle w:val="NoSpacing"/>
               <w:widowControl/>
+              <w:suppressAutoHyphens w:val="true"/>
               <w:spacing w:before="0" w:after="0"/>
               <w:jc w:val="center"/>
               <w:rPr>
@@ -420,6 +424,7 @@
             <w:pPr>
               <w:pStyle w:val="NoSpacing"/>
               <w:widowControl/>
+              <w:suppressAutoHyphens w:val="true"/>
               <w:spacing w:before="0" w:after="0"/>
               <w:jc w:val="start"/>
               <w:rPr>
@@ -441,7 +446,7 @@
         </w:tc>
         <w:tc>
           <w:tcPr>
-            <w:tcW w:w="5720" w:type="dxa"/>
+            <w:tcW w:w="5721" w:type="dxa"/>
             <w:tcBorders/>
             <w:vAlign w:val="center"/>
           </w:tcPr>
@@ -449,6 +454,7 @@
             <w:pPr>
               <w:pStyle w:val="NoSpacing"/>
               <w:widowControl/>
+              <w:suppressAutoHyphens w:val="true"/>
               <w:spacing w:before="0" w:after="0"/>
               <w:jc w:val="start"/>
               <w:rPr>
@@ -475,7 +481,7 @@
         </w:trPr>
         <w:tc>
           <w:tcPr>
-            <w:tcW w:w="960" w:type="dxa"/>
+            <w:tcW w:w="959" w:type="dxa"/>
             <w:tcBorders/>
             <w:vAlign w:val="center"/>
           </w:tcPr>
@@ -483,6 +489,7 @@
             <w:pPr>
               <w:pStyle w:val="NoSpacing"/>
               <w:widowControl/>
+              <w:suppressAutoHyphens w:val="true"/>
               <w:spacing w:before="0" w:after="0"/>
               <w:jc w:val="center"/>
               <w:rPr>
@@ -512,6 +519,7 @@
             <w:pPr>
               <w:pStyle w:val="NoSpacing"/>
               <w:widowControl/>
+              <w:suppressAutoHyphens w:val="true"/>
               <w:spacing w:before="0" w:after="0"/>
               <w:jc w:val="start"/>
               <w:rPr>
@@ -533,7 +541,7 @@
         </w:tc>
         <w:tc>
           <w:tcPr>
-            <w:tcW w:w="5720" w:type="dxa"/>
+            <w:tcW w:w="5721" w:type="dxa"/>
             <w:tcBorders/>
             <w:vAlign w:val="center"/>
           </w:tcPr>
@@ -541,6 +549,7 @@
             <w:pPr>
               <w:pStyle w:val="NoSpacing"/>
               <w:widowControl/>
+              <w:suppressAutoHyphens w:val="true"/>
               <w:spacing w:before="0" w:after="0"/>
               <w:jc w:val="start"/>
               <w:rPr>
@@ -567,7 +576,7 @@
         </w:trPr>
         <w:tc>
           <w:tcPr>
-            <w:tcW w:w="960" w:type="dxa"/>
+            <w:tcW w:w="959" w:type="dxa"/>
             <w:tcBorders/>
             <w:vAlign w:val="center"/>
           </w:tcPr>
@@ -575,6 +584,7 @@
             <w:pPr>
               <w:pStyle w:val="NoSpacing"/>
               <w:widowControl/>
+              <w:suppressAutoHyphens w:val="true"/>
               <w:spacing w:before="0" w:after="0"/>
               <w:jc w:val="center"/>
               <w:rPr>
@@ -604,6 +614,7 @@
             <w:pPr>
               <w:pStyle w:val="NoSpacing"/>
               <w:widowControl/>
+              <w:suppressAutoHyphens w:val="true"/>
               <w:spacing w:before="0" w:after="0"/>
               <w:jc w:val="start"/>
               <w:rPr>
@@ -625,7 +636,7 @@
         </w:tc>
         <w:tc>
           <w:tcPr>
-            <w:tcW w:w="5720" w:type="dxa"/>
+            <w:tcW w:w="5721" w:type="dxa"/>
             <w:tcBorders/>
             <w:vAlign w:val="center"/>
           </w:tcPr>
@@ -633,6 +644,7 @@
             <w:pPr>
               <w:pStyle w:val="NoSpacing"/>
               <w:widowControl/>
+              <w:suppressAutoHyphens w:val="true"/>
               <w:spacing w:before="0" w:after="0"/>
               <w:jc w:val="start"/>
               <w:rPr>
@@ -657,7 +669,7 @@
         <w:trPr/>
         <w:tc>
           <w:tcPr>
-            <w:tcW w:w="960" w:type="dxa"/>
+            <w:tcW w:w="959" w:type="dxa"/>
             <w:tcBorders/>
             <w:vAlign w:val="center"/>
           </w:tcPr>
@@ -665,6 +677,7 @@
             <w:pPr>
               <w:pStyle w:val="NoSpacing"/>
               <w:widowControl/>
+              <w:suppressAutoHyphens w:val="true"/>
               <w:spacing w:before="0" w:after="0"/>
               <w:jc w:val="center"/>
               <w:rPr>
@@ -694,6 +707,7 @@
             <w:pPr>
               <w:pStyle w:val="NoSpacing"/>
               <w:widowControl/>
+              <w:suppressAutoHyphens w:val="true"/>
               <w:spacing w:before="0" w:after="0"/>
               <w:jc w:val="start"/>
               <w:rPr>
@@ -715,7 +729,7 @@
         </w:tc>
         <w:tc>
           <w:tcPr>
-            <w:tcW w:w="5720" w:type="dxa"/>
+            <w:tcW w:w="5721" w:type="dxa"/>
             <w:tcBorders/>
             <w:vAlign w:val="center"/>
           </w:tcPr>
@@ -723,6 +737,7 @@
             <w:pPr>
               <w:pStyle w:val="NoSpacing"/>
               <w:widowControl/>
+              <w:suppressAutoHyphens w:val="true"/>
               <w:spacing w:before="0" w:after="0"/>
               <w:jc w:val="start"/>
               <w:rPr>
@@ -803,9 +818,9 @@
       </w:tblPr>
       <w:tblGrid>
         <w:gridCol w:w="2415"/>
-        <w:gridCol w:w="694"/>
+        <w:gridCol w:w="693"/>
         <w:gridCol w:w="1030"/>
-        <w:gridCol w:w="5671"/>
+        <w:gridCol w:w="5672"/>
       </w:tblGrid>
       <w:tr>
         <w:trPr>
@@ -822,6 +837,7 @@
             <w:pPr>
               <w:pStyle w:val="NoSpacing"/>
               <w:widowControl/>
+              <w:suppressAutoHyphens w:val="true"/>
               <w:spacing w:before="0" w:after="0"/>
               <w:jc w:val="center"/>
               <w:rPr>
@@ -847,7 +863,7 @@
         </w:tc>
         <w:tc>
           <w:tcPr>
-            <w:tcW w:w="694" w:type="dxa"/>
+            <w:tcW w:w="693" w:type="dxa"/>
             <w:tcBorders/>
             <w:shd w:color="auto" w:fill="A6A6A6" w:themeFill="background1" w:themeFillShade="a6" w:val="clear"/>
             <w:vAlign w:val="bottom"/>
@@ -856,6 +872,7 @@
             <w:pPr>
               <w:pStyle w:val="NoSpacing"/>
               <w:widowControl/>
+              <w:suppressAutoHyphens w:val="true"/>
               <w:spacing w:before="0" w:after="0"/>
               <w:jc w:val="center"/>
               <w:rPr>
@@ -890,6 +907,7 @@
             <w:pPr>
               <w:pStyle w:val="NoSpacing"/>
               <w:widowControl/>
+              <w:suppressAutoHyphens w:val="true"/>
               <w:spacing w:before="0" w:after="0"/>
               <w:jc w:val="center"/>
               <w:rPr>
@@ -916,6 +934,7 @@
             <w:pPr>
               <w:pStyle w:val="NoSpacing"/>
               <w:widowControl/>
+              <w:suppressAutoHyphens w:val="true"/>
               <w:spacing w:before="0" w:after="0"/>
               <w:jc w:val="center"/>
               <w:rPr>
@@ -941,7 +960,7 @@
         </w:tc>
         <w:tc>
           <w:tcPr>
-            <w:tcW w:w="5671" w:type="dxa"/>
+            <w:tcW w:w="5672" w:type="dxa"/>
             <w:tcBorders/>
             <w:shd w:color="auto" w:fill="A6A6A6" w:themeFill="background1" w:themeFillShade="a6" w:val="clear"/>
             <w:vAlign w:val="bottom"/>
@@ -950,6 +969,7 @@
             <w:pPr>
               <w:pStyle w:val="NoSpacing"/>
               <w:widowControl/>
+              <w:suppressAutoHyphens w:val="true"/>
               <w:spacing w:before="0" w:after="0"/>
               <w:jc w:val="start"/>
               <w:rPr>
@@ -989,6 +1009,7 @@
             <w:pPr>
               <w:pStyle w:val="NoSpacing"/>
               <w:widowControl/>
+              <w:suppressAutoHyphens w:val="true"/>
               <w:spacing w:before="0" w:after="0"/>
               <w:jc w:val="start"/>
               <w:rPr>
@@ -1010,7 +1031,7 @@
         </w:tc>
         <w:tc>
           <w:tcPr>
-            <w:tcW w:w="694" w:type="dxa"/>
+            <w:tcW w:w="693" w:type="dxa"/>
             <w:vMerge w:val="restart"/>
             <w:tcBorders/>
             <w:shd w:color="auto" w:fill="D9D9D9" w:themeFill="background1" w:themeFillShade="d9" w:val="clear"/>
@@ -1019,6 +1040,7 @@
             <w:pPr>
               <w:pStyle w:val="NoSpacing"/>
               <w:widowControl/>
+              <w:suppressAutoHyphens w:val="true"/>
               <w:spacing w:before="0" w:after="0"/>
               <w:jc w:val="center"/>
               <w:rPr>
@@ -1052,6 +1074,7 @@
             <w:pPr>
               <w:pStyle w:val="NoSpacing"/>
               <w:widowControl/>
+              <w:suppressAutoHyphens w:val="true"/>
               <w:spacing w:before="0" w:after="0"/>
               <w:jc w:val="start"/>
               <w:rPr>
@@ -1077,7 +1100,7 @@
         </w:tc>
         <w:tc>
           <w:tcPr>
-            <w:tcW w:w="5671" w:type="dxa"/>
+            <w:tcW w:w="5672" w:type="dxa"/>
             <w:tcBorders/>
             <w:shd w:color="auto" w:fill="D9D9D9" w:themeFill="background1" w:themeFillShade="d9" w:val="clear"/>
           </w:tcPr>
@@ -1085,6 +1108,7 @@
             <w:pPr>
               <w:pStyle w:val="NoSpacing"/>
               <w:widowControl/>
+              <w:suppressAutoHyphens w:val="true"/>
               <w:spacing w:before="0" w:after="0"/>
               <w:jc w:val="start"/>
               <w:rPr>
@@ -1124,6 +1148,7 @@
             <w:pPr>
               <w:pStyle w:val="NoSpacing"/>
               <w:widowControl/>
+              <w:suppressAutoHyphens w:val="true"/>
               <w:spacing w:before="0" w:after="0"/>
               <w:jc w:val="start"/>
               <w:rPr>
@@ -1133,18 +1158,15 @@
             </w:pPr>
             <w:r>
               <w:rPr>
-                <w:rFonts w:eastAsia="Calibri" w:cs=""/>
-                <w:kern w:val="0"/>
                 <w:sz w:val="18"/>
                 <w:szCs w:val="18"/>
-                <w:lang w:val="en-US" w:eastAsia="en-US" w:bidi="ar-SA"/>
-              </w:rPr>
-            </w:r>
-          </w:p>
-        </w:tc>
-        <w:tc>
-          <w:tcPr>
-            <w:tcW w:w="694" w:type="dxa"/>
+              </w:rPr>
+            </w:r>
+          </w:p>
+        </w:tc>
+        <w:tc>
+          <w:tcPr>
+            <w:tcW w:w="693" w:type="dxa"/>
             <w:vMerge w:val="continue"/>
             <w:tcBorders/>
             <w:shd w:color="auto" w:fill="D9D9D9" w:themeFill="background1" w:themeFillShade="d9" w:val="clear"/>
@@ -1153,6 +1175,7 @@
             <w:pPr>
               <w:pStyle w:val="NoSpacing"/>
               <w:widowControl/>
+              <w:suppressAutoHyphens w:val="true"/>
               <w:spacing w:before="0" w:after="0"/>
               <w:jc w:val="start"/>
               <w:rPr>
@@ -1164,53 +1187,17 @@
             </w:pPr>
             <w:r>
               <w:rPr>
-                <w:rFonts w:eastAsia="Calibri" w:cs=""/>
-                <w:i/>
-                <w:iCs/>
-                <w:kern w:val="0"/>
-                <w:sz w:val="18"/>
-                <w:szCs w:val="18"/>
-                <w:lang w:val="en-US" w:eastAsia="en-US" w:bidi="ar-SA"/>
-              </w:rPr>
-            </w:r>
-          </w:p>
-        </w:tc>
-        <w:tc>
-          <w:tcPr>
-            <w:tcW w:w="1030" w:type="dxa"/>
-            <w:tcBorders/>
-            <w:shd w:color="auto" w:fill="D9D9D9" w:themeFill="background1" w:themeFillShade="d9" w:val="clear"/>
-          </w:tcPr>
-          <w:p>
-            <w:pPr>
-              <w:pStyle w:val="NoSpacing"/>
-              <w:widowControl/>
-              <w:spacing w:before="0" w:after="0"/>
-              <w:jc w:val="start"/>
-              <w:rPr>
                 <w:i/>
                 <w:iCs/>
                 <w:sz w:val="18"/>
                 <w:szCs w:val="18"/>
               </w:rPr>
-            </w:pPr>
-            <w:r>
-              <w:rPr>
-                <w:rFonts w:eastAsia="Calibri" w:cs=""/>
-                <w:i/>
-                <w:iCs/>
-                <w:kern w:val="0"/>
-                <w:sz w:val="18"/>
-                <w:szCs w:val="18"/>
-                <w:lang w:val="en-US" w:eastAsia="en-US" w:bidi="ar-SA"/>
-              </w:rPr>
-              <w:t>Week 04</w:t>
-            </w:r>
-          </w:p>
-        </w:tc>
-        <w:tc>
-          <w:tcPr>
-            <w:tcW w:w="5671" w:type="dxa"/>
+            </w:r>
+          </w:p>
+        </w:tc>
+        <w:tc>
+          <w:tcPr>
+            <w:tcW w:w="1030" w:type="dxa"/>
             <w:tcBorders/>
             <w:shd w:color="auto" w:fill="D9D9D9" w:themeFill="background1" w:themeFillShade="d9" w:val="clear"/>
           </w:tcPr>
@@ -1218,6 +1205,7 @@
             <w:pPr>
               <w:pStyle w:val="NoSpacing"/>
               <w:widowControl/>
+              <w:suppressAutoHyphens w:val="true"/>
               <w:spacing w:before="0" w:after="0"/>
               <w:jc w:val="start"/>
               <w:rPr>
@@ -1237,13 +1225,21 @@
                 <w:szCs w:val="18"/>
                 <w:lang w:val="en-US" w:eastAsia="en-US" w:bidi="ar-SA"/>
               </w:rPr>
-              <w:t>At the end of our first project, one of my teammates was really having a hard time figuring out how he could contribute to our project. My natural instinct in this case would have been to get the problem done on my own, but instead, I worked together with my teammate to get him started and then I followed up with him afterward to make sure he was able to get his task done.</w:t>
-            </w:r>
-          </w:p>
-          <w:p>
-            <w:pPr>
-              <w:pStyle w:val="NoSpacing"/>
-              <w:widowControl/>
+              <w:t>Week 04</w:t>
+            </w:r>
+          </w:p>
+        </w:tc>
+        <w:tc>
+          <w:tcPr>
+            <w:tcW w:w="5672" w:type="dxa"/>
+            <w:tcBorders/>
+            <w:shd w:color="auto" w:fill="D9D9D9" w:themeFill="background1" w:themeFillShade="d9" w:val="clear"/>
+          </w:tcPr>
+          <w:p>
+            <w:pPr>
+              <w:pStyle w:val="NoSpacing"/>
+              <w:widowControl/>
+              <w:suppressAutoHyphens w:val="true"/>
               <w:spacing w:before="0" w:after="0"/>
               <w:jc w:val="start"/>
               <w:rPr>
@@ -1263,12 +1259,37 @@
                 <w:szCs w:val="18"/>
                 <w:lang w:val="en-US" w:eastAsia="en-US" w:bidi="ar-SA"/>
               </w:rPr>
-            </w:r>
-          </w:p>
-          <w:p>
-            <w:pPr>
-              <w:pStyle w:val="NoSpacing"/>
-              <w:widowControl/>
+              <w:t>At the end of our first project, one of my teammates was really having a hard time figuring out how he could contribute to our project. My natural instinct in this case would have been to get the problem done on my own, but instead, I worked together with my teammate to get him started and then I followed up with him afterward to make sure he was able to get his task done.</w:t>
+            </w:r>
+          </w:p>
+          <w:p>
+            <w:pPr>
+              <w:pStyle w:val="NoSpacing"/>
+              <w:widowControl/>
+              <w:suppressAutoHyphens w:val="true"/>
+              <w:spacing w:before="0" w:after="0"/>
+              <w:jc w:val="start"/>
+              <w:rPr>
+                <w:i/>
+                <w:iCs/>
+                <w:sz w:val="18"/>
+                <w:szCs w:val="18"/>
+              </w:rPr>
+            </w:pPr>
+            <w:r>
+              <w:rPr>
+                <w:i/>
+                <w:iCs/>
+                <w:sz w:val="18"/>
+                <w:szCs w:val="18"/>
+              </w:rPr>
+            </w:r>
+          </w:p>
+          <w:p>
+            <w:pPr>
+              <w:pStyle w:val="NoSpacing"/>
+              <w:widowControl/>
+              <w:suppressAutoHyphens w:val="true"/>
               <w:spacing w:before="0" w:after="0"/>
               <w:jc w:val="start"/>
               <w:rPr>
@@ -1308,6 +1329,7 @@
             <w:pPr>
               <w:pStyle w:val="NoSpacing"/>
               <w:widowControl/>
+              <w:suppressAutoHyphens w:val="true"/>
               <w:spacing w:before="0" w:after="0"/>
               <w:jc w:val="start"/>
               <w:rPr>
@@ -1317,18 +1339,15 @@
             </w:pPr>
             <w:r>
               <w:rPr>
-                <w:rFonts w:eastAsia="Calibri" w:cs=""/>
-                <w:kern w:val="0"/>
                 <w:sz w:val="18"/>
                 <w:szCs w:val="18"/>
-                <w:lang w:val="en-US" w:eastAsia="en-US" w:bidi="ar-SA"/>
-              </w:rPr>
-            </w:r>
-          </w:p>
-        </w:tc>
-        <w:tc>
-          <w:tcPr>
-            <w:tcW w:w="694" w:type="dxa"/>
+              </w:rPr>
+            </w:r>
+          </w:p>
+        </w:tc>
+        <w:tc>
+          <w:tcPr>
+            <w:tcW w:w="693" w:type="dxa"/>
             <w:vMerge w:val="continue"/>
             <w:tcBorders/>
             <w:shd w:color="auto" w:fill="D9D9D9" w:themeFill="background1" w:themeFillShade="d9" w:val="clear"/>
@@ -1337,6 +1356,7 @@
             <w:pPr>
               <w:pStyle w:val="NoSpacing"/>
               <w:widowControl/>
+              <w:suppressAutoHyphens w:val="true"/>
               <w:spacing w:before="0" w:after="0"/>
               <w:jc w:val="start"/>
               <w:rPr>
@@ -1348,52 +1368,17 @@
             </w:pPr>
             <w:r>
               <w:rPr>
-                <w:rFonts w:eastAsia="Calibri" w:cs=""/>
-                <w:i/>
-                <w:iCs/>
-                <w:kern w:val="0"/>
-                <w:sz w:val="18"/>
-                <w:szCs w:val="18"/>
-                <w:lang w:val="en-US" w:eastAsia="en-US" w:bidi="ar-SA"/>
-              </w:rPr>
-            </w:r>
-          </w:p>
-        </w:tc>
-        <w:tc>
-          <w:tcPr>
-            <w:tcW w:w="1030" w:type="dxa"/>
-            <w:tcBorders/>
-            <w:shd w:color="auto" w:fill="D9D9D9" w:themeFill="background1" w:themeFillShade="d9" w:val="clear"/>
-          </w:tcPr>
-          <w:p>
-            <w:pPr>
-              <w:pStyle w:val="NoSpacing"/>
-              <w:widowControl/>
-              <w:spacing w:before="0" w:after="0"/>
-              <w:jc w:val="start"/>
-              <w:rPr>
                 <w:i/>
                 <w:iCs/>
                 <w:sz w:val="18"/>
                 <w:szCs w:val="18"/>
               </w:rPr>
-            </w:pPr>
-            <w:r>
-              <w:rPr>
-                <w:rFonts w:eastAsia="Calibri" w:cs=""/>
-                <w:i/>
-                <w:iCs/>
-                <w:kern w:val="0"/>
-                <w:sz w:val="18"/>
-                <w:szCs w:val="18"/>
-                <w:lang w:val="en-US" w:eastAsia="en-US" w:bidi="ar-SA"/>
-              </w:rPr>
-            </w:r>
-          </w:p>
-        </w:tc>
-        <w:tc>
-          <w:tcPr>
-            <w:tcW w:w="5671" w:type="dxa"/>
+            </w:r>
+          </w:p>
+        </w:tc>
+        <w:tc>
+          <w:tcPr>
+            <w:tcW w:w="1030" w:type="dxa"/>
             <w:tcBorders/>
             <w:shd w:color="auto" w:fill="D9D9D9" w:themeFill="background1" w:themeFillShade="d9" w:val="clear"/>
           </w:tcPr>
@@ -1401,6 +1386,7 @@
             <w:pPr>
               <w:pStyle w:val="NoSpacing"/>
               <w:widowControl/>
+              <w:suppressAutoHyphens w:val="true"/>
               <w:spacing w:before="0" w:after="0"/>
               <w:jc w:val="start"/>
               <w:rPr>
@@ -1412,13 +1398,40 @@
             </w:pPr>
             <w:r>
               <w:rPr>
-                <w:rFonts w:eastAsia="Calibri" w:cs=""/>
                 <w:i/>
                 <w:iCs/>
-                <w:kern w:val="0"/>
                 <w:sz w:val="18"/>
                 <w:szCs w:val="18"/>
-                <w:lang w:val="en-US" w:eastAsia="en-US" w:bidi="ar-SA"/>
+              </w:rPr>
+            </w:r>
+          </w:p>
+        </w:tc>
+        <w:tc>
+          <w:tcPr>
+            <w:tcW w:w="5672" w:type="dxa"/>
+            <w:tcBorders/>
+            <w:shd w:color="auto" w:fill="D9D9D9" w:themeFill="background1" w:themeFillShade="d9" w:val="clear"/>
+          </w:tcPr>
+          <w:p>
+            <w:pPr>
+              <w:pStyle w:val="NoSpacing"/>
+              <w:widowControl/>
+              <w:suppressAutoHyphens w:val="true"/>
+              <w:spacing w:before="0" w:after="0"/>
+              <w:jc w:val="start"/>
+              <w:rPr>
+                <w:i/>
+                <w:iCs/>
+                <w:sz w:val="18"/>
+                <w:szCs w:val="18"/>
+              </w:rPr>
+            </w:pPr>
+            <w:r>
+              <w:rPr>
+                <w:i/>
+                <w:iCs/>
+                <w:sz w:val="18"/>
+                <w:szCs w:val="18"/>
               </w:rPr>
             </w:r>
           </w:p>
@@ -1516,10 +1529,10 @@
         <w:tblLook w:val="04a0" w:noHBand="0" w:noVBand="1" w:firstColumn="1" w:lastRow="0" w:lastColumn="0" w:firstRow="1"/>
       </w:tblPr>
       <w:tblGrid>
-        <w:gridCol w:w="2854"/>
-        <w:gridCol w:w="856"/>
-        <w:gridCol w:w="994"/>
-        <w:gridCol w:w="5106"/>
+        <w:gridCol w:w="2853"/>
+        <w:gridCol w:w="851"/>
+        <w:gridCol w:w="999"/>
+        <w:gridCol w:w="5107"/>
       </w:tblGrid>
       <w:tr>
         <w:trPr>
@@ -1527,7 +1540,7 @@
         </w:trPr>
         <w:tc>
           <w:tcPr>
-            <w:tcW w:w="2854" w:type="dxa"/>
+            <w:tcW w:w="2853" w:type="dxa"/>
             <w:tcBorders/>
             <w:shd w:color="auto" w:fill="000000" w:themeFill="text1" w:val="clear"/>
             <w:vAlign w:val="bottom"/>
@@ -1536,6 +1549,7 @@
             <w:pPr>
               <w:pStyle w:val="NoSpacing"/>
               <w:widowControl/>
+              <w:suppressAutoHyphens w:val="true"/>
               <w:spacing w:before="0" w:after="0"/>
               <w:jc w:val="center"/>
               <w:rPr>
@@ -1563,7 +1577,7 @@
         </w:tc>
         <w:tc>
           <w:tcPr>
-            <w:tcW w:w="856" w:type="dxa"/>
+            <w:tcW w:w="851" w:type="dxa"/>
             <w:tcBorders/>
             <w:shd w:color="auto" w:fill="000000" w:themeFill="text1" w:val="clear"/>
             <w:vAlign w:val="bottom"/>
@@ -1572,6 +1586,7 @@
             <w:pPr>
               <w:pStyle w:val="NoSpacing"/>
               <w:widowControl/>
+              <w:suppressAutoHyphens w:val="true"/>
               <w:spacing w:before="0" w:after="0"/>
               <w:jc w:val="center"/>
               <w:rPr>
@@ -1599,7 +1614,7 @@
         </w:tc>
         <w:tc>
           <w:tcPr>
-            <w:tcW w:w="994" w:type="dxa"/>
+            <w:tcW w:w="999" w:type="dxa"/>
             <w:tcBorders/>
             <w:shd w:color="auto" w:fill="000000" w:themeFill="text1" w:val="clear"/>
             <w:vAlign w:val="bottom"/>
@@ -1608,6 +1623,7 @@
             <w:pPr>
               <w:pStyle w:val="NoSpacing"/>
               <w:widowControl/>
+              <w:suppressAutoHyphens w:val="true"/>
               <w:spacing w:before="0" w:after="0"/>
               <w:jc w:val="center"/>
               <w:rPr>
@@ -1635,7 +1651,7 @@
         </w:tc>
         <w:tc>
           <w:tcPr>
-            <w:tcW w:w="5106" w:type="dxa"/>
+            <w:tcW w:w="5107" w:type="dxa"/>
             <w:tcBorders/>
             <w:shd w:color="auto" w:fill="000000" w:themeFill="text1" w:val="clear"/>
             <w:vAlign w:val="bottom"/>
@@ -1644,6 +1660,7 @@
             <w:pPr>
               <w:pStyle w:val="NoSpacing"/>
               <w:widowControl/>
+              <w:suppressAutoHyphens w:val="true"/>
               <w:spacing w:before="0" w:after="0"/>
               <w:jc w:val="start"/>
               <w:rPr>
@@ -1676,7 +1693,7 @@
         </w:trPr>
         <w:tc>
           <w:tcPr>
-            <w:tcW w:w="2854" w:type="dxa"/>
+            <w:tcW w:w="2853" w:type="dxa"/>
             <w:vMerge w:val="restart"/>
             <w:tcBorders/>
           </w:tcPr>
@@ -1684,6 +1701,7 @@
             <w:pPr>
               <w:pStyle w:val="NoSpacing"/>
               <w:widowControl/>
+              <w:suppressAutoHyphens w:val="true"/>
               <w:spacing w:before="0" w:after="0"/>
               <w:jc w:val="start"/>
               <w:rPr>
@@ -1708,7 +1726,7 @@
         </w:tc>
         <w:tc>
           <w:tcPr>
-            <w:tcW w:w="856" w:type="dxa"/>
+            <w:tcW w:w="851" w:type="dxa"/>
             <w:vMerge w:val="restart"/>
             <w:tcBorders/>
           </w:tcPr>
@@ -1716,6 +1734,7 @@
             <w:pPr>
               <w:pStyle w:val="NoSpacing"/>
               <w:widowControl/>
+              <w:suppressAutoHyphens w:val="true"/>
               <w:spacing w:before="0" w:after="0"/>
               <w:jc w:val="center"/>
               <w:rPr>
@@ -1734,19 +1753,52 @@
                 <w:szCs w:val="22"/>
                 <w:lang w:val="en-US" w:eastAsia="en-US" w:bidi="ar-SA"/>
               </w:rPr>
+              <w:t>3</w:t>
+            </w:r>
+          </w:p>
+        </w:tc>
+        <w:tc>
+          <w:tcPr>
+            <w:tcW w:w="999" w:type="dxa"/>
+            <w:tcBorders/>
+          </w:tcPr>
+          <w:p>
+            <w:pPr>
+              <w:pStyle w:val="NoSpacing"/>
+              <w:widowControl/>
+              <w:suppressAutoHyphens w:val="true"/>
+              <w:spacing w:before="0" w:after="0"/>
+              <w:jc w:val="start"/>
+              <w:rPr>
+                <w:rFonts w:ascii="Calibri" w:hAnsi="Calibri" w:eastAsia="Calibri" w:cs=""/>
+                <w:kern w:val="0"/>
+                <w:sz w:val="22"/>
+                <w:szCs w:val="22"/>
+                <w:lang w:val="en-US" w:eastAsia="en-US" w:bidi="ar-SA"/>
+              </w:rPr>
+            </w:pPr>
+            <w:r>
+              <w:rPr>
+                <w:rFonts w:eastAsia="Calibri" w:cs=""/>
+                <w:kern w:val="0"/>
+                <w:sz w:val="22"/>
+                <w:szCs w:val="22"/>
+                <w:lang w:val="en-US" w:eastAsia="en-US" w:bidi="ar-SA"/>
+              </w:rPr>
               <w:t>2</w:t>
             </w:r>
           </w:p>
         </w:tc>
         <w:tc>
           <w:tcPr>
-            <w:tcW w:w="994" w:type="dxa"/>
-            <w:tcBorders/>
-          </w:tcPr>
-          <w:p>
-            <w:pPr>
-              <w:pStyle w:val="NoSpacing"/>
-              <w:widowControl/>
+            <w:tcW w:w="5107" w:type="dxa"/>
+            <w:tcBorders/>
+          </w:tcPr>
+          <w:p>
+            <w:pPr>
+              <w:pStyle w:val="NoSpacing"/>
+              <w:widowControl/>
+              <w:suppressAutoHyphens w:val="true"/>
               <w:spacing w:before="0" w:after="0"/>
               <w:jc w:val="start"/>
               <w:rPr>
@@ -1765,38 +1817,7 @@
                 <w:szCs w:val="22"/>
                 <w:lang w:val="en-US" w:eastAsia="en-US" w:bidi="ar-SA"/>
               </w:rPr>
-              <w:t>2</w:t>
-            </w:r>
-          </w:p>
-        </w:tc>
-        <w:tc>
-          <w:tcPr>
-            <w:tcW w:w="5106" w:type="dxa"/>
-            <w:tcBorders/>
-          </w:tcPr>
-          <w:p>
-            <w:pPr>
-              <w:pStyle w:val="NoSpacing"/>
-              <w:widowControl/>
-              <w:spacing w:before="0" w:after="0"/>
-              <w:jc w:val="start"/>
-              <w:rPr>
-                <w:rFonts w:ascii="Calibri" w:hAnsi="Calibri" w:eastAsia="Calibri" w:cs=""/>
-                <w:kern w:val="0"/>
-                <w:sz w:val="22"/>
-                <w:szCs w:val="22"/>
-                <w:lang w:val="en-US" w:eastAsia="en-US" w:bidi="ar-SA"/>
-              </w:rPr>
-            </w:pPr>
-            <w:r>
-              <w:rPr>
-                <w:rFonts w:eastAsia="Calibri" w:cs=""/>
-                <w:kern w:val="0"/>
-                <w:sz w:val="22"/>
-                <w:szCs w:val="22"/>
-                <w:lang w:val="en-US" w:eastAsia="en-US" w:bidi="ar-SA"/>
-              </w:rPr>
-              <w:t>I designed the idea of a movie and TV show tracking application based on a real problem I personally have: forgetting what I am watching. I explored how similar apps work and adapted ideas into my own concept.</w:t>
+              <w:t>I designed and implemented a movie and TV show tracking application based on a real personal need: keeping track of what I am watching. I researched similar applications and adapted their ideas into my own design, adding custom features and improving usability.</w:t>
             </w:r>
           </w:p>
         </w:tc>
@@ -1807,7 +1828,7 @@
         </w:trPr>
         <w:tc>
           <w:tcPr>
-            <w:tcW w:w="2854" w:type="dxa"/>
+            <w:tcW w:w="2853" w:type="dxa"/>
             <w:vMerge w:val="continue"/>
             <w:tcBorders/>
           </w:tcPr>
@@ -1815,6 +1836,7 @@
             <w:pPr>
               <w:pStyle w:val="NoSpacing"/>
               <w:widowControl/>
+              <w:suppressAutoHyphens w:val="true"/>
               <w:spacing w:before="0" w:after="0"/>
               <w:jc w:val="start"/>
               <w:rPr>
@@ -1838,7 +1860,7 @@
         </w:tc>
         <w:tc>
           <w:tcPr>
-            <w:tcW w:w="856" w:type="dxa"/>
+            <w:tcW w:w="851" w:type="dxa"/>
             <w:vMerge w:val="continue"/>
             <w:tcBorders/>
           </w:tcPr>
@@ -1846,6 +1868,7 @@
             <w:pPr>
               <w:pStyle w:val="NoSpacing"/>
               <w:widowControl/>
+              <w:suppressAutoHyphens w:val="true"/>
               <w:spacing w:before="0" w:after="0"/>
               <w:jc w:val="center"/>
               <w:rPr>
@@ -1869,13 +1892,14 @@
         </w:tc>
         <w:tc>
           <w:tcPr>
-            <w:tcW w:w="994" w:type="dxa"/>
-            <w:tcBorders/>
-          </w:tcPr>
-          <w:p>
-            <w:pPr>
-              <w:pStyle w:val="NoSpacing"/>
-              <w:widowControl/>
+            <w:tcW w:w="999" w:type="dxa"/>
+            <w:tcBorders/>
+          </w:tcPr>
+          <w:p>
+            <w:pPr>
+              <w:pStyle w:val="NoSpacing"/>
+              <w:widowControl/>
+              <w:suppressAutoHyphens w:val="true"/>
               <w:spacing w:before="0" w:after="0"/>
               <w:jc w:val="start"/>
               <w:rPr>
@@ -1900,13 +1924,14 @@
         </w:tc>
         <w:tc>
           <w:tcPr>
-            <w:tcW w:w="5106" w:type="dxa"/>
-            <w:tcBorders/>
-          </w:tcPr>
-          <w:p>
-            <w:pPr>
-              <w:pStyle w:val="NoSpacing"/>
-              <w:widowControl/>
+            <w:tcW w:w="5107" w:type="dxa"/>
+            <w:tcBorders/>
+          </w:tcPr>
+          <w:p>
+            <w:pPr>
+              <w:pStyle w:val="NoSpacing"/>
+              <w:widowControl/>
+              <w:suppressAutoHyphens w:val="true"/>
               <w:spacing w:before="0" w:after="0"/>
               <w:jc w:val="start"/>
               <w:rPr>
@@ -1925,7 +1950,400 @@
                 <w:szCs w:val="22"/>
                 <w:lang w:val="en-US" w:eastAsia="en-US" w:bidi="ar-SA"/>
               </w:rPr>
-              <w:t>I planned features such as tracking episodes, watchlists, and recommendations, which go beyond basic requirements and show creative thinking in the project design.</w:t>
+              <w:t>I went beyond basic requirements by implementing features such as dynamic search, watchlist management, and detailed views for each movie or show. I also designed the user interface with a modern layout and interactive elements, improving the overall user experience through JavaScript and CSS.</w:t>
+            </w:r>
+          </w:p>
+        </w:tc>
+      </w:tr>
+      <w:tr>
+        <w:trPr>
+          <w:trHeight w:val="279" w:hRule="atLeast"/>
+        </w:trPr>
+        <w:tc>
+          <w:tcPr>
+            <w:tcW w:w="2853" w:type="dxa"/>
+            <w:vMerge w:val="restart"/>
+            <w:tcBorders/>
+          </w:tcPr>
+          <w:p>
+            <w:pPr>
+              <w:pStyle w:val="NoSpacing"/>
+              <w:widowControl/>
+              <w:suppressAutoHyphens w:val="true"/>
+              <w:spacing w:before="0" w:after="0"/>
+              <w:jc w:val="start"/>
+              <w:rPr>
+                <w:rFonts w:ascii="Calibri" w:hAnsi="Calibri" w:eastAsia="Calibri" w:cs=""/>
+                <w:kern w:val="0"/>
+                <w:sz w:val="22"/>
+                <w:szCs w:val="22"/>
+                <w:lang w:val="en-US" w:eastAsia="en-US" w:bidi="ar-SA"/>
+              </w:rPr>
+            </w:pPr>
+            <w:r>
+              <w:rPr>
+                <w:rFonts w:eastAsia="Calibri" w:cs=""/>
+                <w:kern w:val="0"/>
+                <w:sz w:val="22"/>
+                <w:szCs w:val="22"/>
+                <w:lang w:val="en-US" w:eastAsia="en-US" w:bidi="ar-SA"/>
+              </w:rPr>
+              <w:t>Become more dexterous at exploring your environment.</w:t>
+            </w:r>
+          </w:p>
+        </w:tc>
+        <w:tc>
+          <w:tcPr>
+            <w:tcW w:w="851" w:type="dxa"/>
+            <w:vMerge w:val="restart"/>
+            <w:tcBorders/>
+          </w:tcPr>
+          <w:p>
+            <w:pPr>
+              <w:pStyle w:val="NoSpacing"/>
+              <w:widowControl/>
+              <w:suppressAutoHyphens w:val="true"/>
+              <w:spacing w:before="0" w:after="0"/>
+              <w:jc w:val="center"/>
+              <w:rPr>
+                <w:rFonts w:ascii="Calibri" w:hAnsi="Calibri" w:eastAsia="Calibri" w:cs=""/>
+                <w:kern w:val="0"/>
+                <w:sz w:val="22"/>
+                <w:szCs w:val="22"/>
+                <w:lang w:val="en-US" w:eastAsia="en-US" w:bidi="ar-SA"/>
+              </w:rPr>
+            </w:pPr>
+            <w:r>
+              <w:rPr>
+                <w:rFonts w:eastAsia="Calibri" w:cs=""/>
+                <w:kern w:val="0"/>
+                <w:sz w:val="22"/>
+                <w:szCs w:val="22"/>
+                <w:lang w:val="en-US" w:eastAsia="en-US" w:bidi="ar-SA"/>
+              </w:rPr>
+              <w:t>3</w:t>
+            </w:r>
+          </w:p>
+        </w:tc>
+        <w:tc>
+          <w:tcPr>
+            <w:tcW w:w="999" w:type="dxa"/>
+            <w:tcBorders/>
+          </w:tcPr>
+          <w:p>
+            <w:pPr>
+              <w:pStyle w:val="NoSpacing"/>
+              <w:widowControl/>
+              <w:suppressAutoHyphens w:val="true"/>
+              <w:spacing w:before="0" w:after="0"/>
+              <w:jc w:val="start"/>
+              <w:rPr>
+                <w:rFonts w:ascii="Calibri" w:hAnsi="Calibri" w:eastAsia="Calibri" w:cs=""/>
+                <w:kern w:val="0"/>
+                <w:sz w:val="22"/>
+                <w:szCs w:val="22"/>
+                <w:lang w:val="en-US" w:eastAsia="en-US" w:bidi="ar-SA"/>
+              </w:rPr>
+            </w:pPr>
+            <w:r>
+              <w:rPr>
+                <w:rFonts w:eastAsia="Calibri" w:cs=""/>
+                <w:kern w:val="0"/>
+                <w:sz w:val="22"/>
+                <w:szCs w:val="22"/>
+                <w:lang w:val="en-US" w:eastAsia="en-US" w:bidi="ar-SA"/>
+              </w:rPr>
+              <w:t>3</w:t>
+            </w:r>
+          </w:p>
+        </w:tc>
+        <w:tc>
+          <w:tcPr>
+            <w:tcW w:w="5107" w:type="dxa"/>
+            <w:tcBorders/>
+          </w:tcPr>
+          <w:p>
+            <w:pPr>
+              <w:pStyle w:val="NoSpacing"/>
+              <w:widowControl/>
+              <w:suppressAutoHyphens w:val="true"/>
+              <w:spacing w:before="0" w:after="0"/>
+              <w:jc w:val="start"/>
+              <w:rPr>
+                <w:rFonts w:ascii="Calibri" w:hAnsi="Calibri" w:eastAsia="Calibri" w:cs=""/>
+                <w:kern w:val="0"/>
+                <w:sz w:val="22"/>
+                <w:szCs w:val="22"/>
+                <w:lang w:val="en-US" w:eastAsia="en-US" w:bidi="ar-SA"/>
+              </w:rPr>
+            </w:pPr>
+            <w:r>
+              <w:rPr>
+                <w:rFonts w:eastAsia="Calibri" w:cs=""/>
+                <w:kern w:val="0"/>
+                <w:sz w:val="22"/>
+                <w:szCs w:val="22"/>
+                <w:lang w:val="en-US" w:eastAsia="en-US" w:bidi="ar-SA"/>
+              </w:rPr>
+              <w:t>I explored how to work with third-party APIs such as TMDb and OMDb by reading documentation and experimenting with different endpoints. I learned how to use Fetch with async/await to retrieve and process data dynamically.</w:t>
+            </w:r>
+          </w:p>
+        </w:tc>
+      </w:tr>
+      <w:tr>
+        <w:trPr>
+          <w:trHeight w:val="279" w:hRule="atLeast"/>
+        </w:trPr>
+        <w:tc>
+          <w:tcPr>
+            <w:tcW w:w="2853" w:type="dxa"/>
+            <w:vMerge w:val="continue"/>
+            <w:tcBorders/>
+          </w:tcPr>
+          <w:p>
+            <w:pPr>
+              <w:pStyle w:val="NoSpacing"/>
+              <w:widowControl/>
+              <w:suppressAutoHyphens w:val="true"/>
+              <w:spacing w:before="0" w:after="0"/>
+              <w:jc w:val="start"/>
+              <w:rPr>
+                <w:rFonts w:ascii="Calibri" w:hAnsi="Calibri" w:eastAsia="Calibri" w:cs=""/>
+                <w:kern w:val="0"/>
+                <w:sz w:val="22"/>
+                <w:szCs w:val="22"/>
+                <w:lang w:val="en-US" w:eastAsia="en-US" w:bidi="ar-SA"/>
+              </w:rPr>
+            </w:pPr>
+            <w:r>
+              <w:rPr>
+                <w:rFonts w:eastAsia="Calibri" w:cs=""/>
+                <w:kern w:val="0"/>
+                <w:sz w:val="22"/>
+                <w:szCs w:val="22"/>
+                <w:lang w:val="en-US" w:eastAsia="en-US" w:bidi="ar-SA"/>
+              </w:rPr>
+            </w:r>
+          </w:p>
+        </w:tc>
+        <w:tc>
+          <w:tcPr>
+            <w:tcW w:w="851" w:type="dxa"/>
+            <w:vMerge w:val="continue"/>
+            <w:tcBorders/>
+          </w:tcPr>
+          <w:p>
+            <w:pPr>
+              <w:pStyle w:val="NoSpacing"/>
+              <w:widowControl/>
+              <w:suppressAutoHyphens w:val="true"/>
+              <w:spacing w:before="0" w:after="0"/>
+              <w:jc w:val="center"/>
+              <w:rPr>
+                <w:rFonts w:ascii="Calibri" w:hAnsi="Calibri" w:eastAsia="Calibri" w:cs=""/>
+                <w:kern w:val="0"/>
+                <w:sz w:val="22"/>
+                <w:szCs w:val="22"/>
+                <w:lang w:val="en-US" w:eastAsia="en-US" w:bidi="ar-SA"/>
+              </w:rPr>
+            </w:pPr>
+            <w:r>
+              <w:rPr>
+                <w:rFonts w:eastAsia="Calibri" w:cs=""/>
+                <w:kern w:val="0"/>
+                <w:sz w:val="22"/>
+                <w:szCs w:val="22"/>
+                <w:lang w:val="en-US" w:eastAsia="en-US" w:bidi="ar-SA"/>
+              </w:rPr>
+            </w:r>
+          </w:p>
+        </w:tc>
+        <w:tc>
+          <w:tcPr>
+            <w:tcW w:w="999" w:type="dxa"/>
+            <w:tcBorders/>
+          </w:tcPr>
+          <w:p>
+            <w:pPr>
+              <w:pStyle w:val="NoSpacing"/>
+              <w:widowControl/>
+              <w:suppressAutoHyphens w:val="true"/>
+              <w:spacing w:before="0" w:after="0"/>
+              <w:jc w:val="start"/>
+              <w:rPr>
+                <w:rFonts w:ascii="Calibri" w:hAnsi="Calibri" w:eastAsia="Calibri" w:cs=""/>
+                <w:kern w:val="0"/>
+                <w:sz w:val="22"/>
+                <w:szCs w:val="22"/>
+                <w:lang w:val="en-US" w:eastAsia="en-US" w:bidi="ar-SA"/>
+              </w:rPr>
+            </w:pPr>
+            <w:r>
+              <w:rPr>
+                <w:rFonts w:eastAsia="Calibri" w:cs=""/>
+                <w:kern w:val="0"/>
+                <w:sz w:val="22"/>
+                <w:szCs w:val="22"/>
+                <w:lang w:val="en-US" w:eastAsia="en-US" w:bidi="ar-SA"/>
+              </w:rPr>
+              <w:t>5</w:t>
+            </w:r>
+          </w:p>
+        </w:tc>
+        <w:tc>
+          <w:tcPr>
+            <w:tcW w:w="5107" w:type="dxa"/>
+            <w:tcBorders/>
+          </w:tcPr>
+          <w:p>
+            <w:pPr>
+              <w:pStyle w:val="NoSpacing"/>
+              <w:rPr/>
+            </w:pPr>
+            <w:r>
+              <w:rPr>
+                <w:rFonts w:eastAsia="Calibri" w:cs=""/>
+                <w:kern w:val="0"/>
+                <w:sz w:val="22"/>
+                <w:szCs w:val="22"/>
+                <w:lang w:val="en-US" w:eastAsia="en-US" w:bidi="ar-SA"/>
+              </w:rPr>
+              <w:t>I also explored modern development tools such as Vite and modular JavaScript. I learned how to organize my project into multiple files and manage imports/exports, which improved scalability and maintainability of my application.</w:t>
+            </w:r>
+          </w:p>
+        </w:tc>
+      </w:tr>
+      <w:tr>
+        <w:trPr>
+          <w:trHeight w:val="279" w:hRule="atLeast"/>
+        </w:trPr>
+        <w:tc>
+          <w:tcPr>
+            <w:tcW w:w="2853" w:type="dxa"/>
+            <w:vMerge w:val="restart"/>
+            <w:tcBorders/>
+          </w:tcPr>
+          <w:p>
+            <w:pPr>
+              <w:pStyle w:val="NoSpacing"/>
+              <w:widowControl/>
+              <w:suppressAutoHyphens w:val="true"/>
+              <w:spacing w:before="0" w:after="0"/>
+              <w:jc w:val="start"/>
+              <w:rPr>
+                <w:rFonts w:ascii="Calibri" w:hAnsi="Calibri" w:eastAsia="Calibri" w:cs=""/>
+                <w:kern w:val="0"/>
+                <w:sz w:val="22"/>
+                <w:szCs w:val="22"/>
+                <w:lang w:val="en-US" w:eastAsia="en-US" w:bidi="ar-SA"/>
+              </w:rPr>
+            </w:pPr>
+            <w:r>
+              <w:rPr>
+                <w:rFonts w:eastAsia="Calibri" w:cs=""/>
+                <w:kern w:val="0"/>
+                <w:sz w:val="22"/>
+                <w:szCs w:val="22"/>
+                <w:lang w:val="en-US" w:eastAsia="en-US" w:bidi="ar-SA"/>
+              </w:rPr>
+              <w:t>Become a person who enjoys helping and learning from others.</w:t>
+            </w:r>
+          </w:p>
+        </w:tc>
+        <w:tc>
+          <w:tcPr>
+            <w:tcW w:w="851" w:type="dxa"/>
+            <w:vMerge w:val="restart"/>
+            <w:tcBorders/>
+          </w:tcPr>
+          <w:p>
+            <w:pPr>
+              <w:pStyle w:val="NoSpacing"/>
+              <w:widowControl/>
+              <w:suppressAutoHyphens w:val="true"/>
+              <w:spacing w:before="0" w:after="0"/>
+              <w:jc w:val="center"/>
+              <w:rPr>
+                <w:rFonts w:ascii="Calibri" w:hAnsi="Calibri" w:eastAsia="Calibri" w:cs=""/>
+                <w:kern w:val="0"/>
+                <w:sz w:val="22"/>
+                <w:szCs w:val="22"/>
+                <w:lang w:val="en-US" w:eastAsia="en-US" w:bidi="ar-SA"/>
+              </w:rPr>
+            </w:pPr>
+            <w:r>
+              <w:rPr>
+                <w:rFonts w:eastAsia="Calibri" w:cs=""/>
+                <w:kern w:val="0"/>
+                <w:sz w:val="22"/>
+                <w:szCs w:val="22"/>
+                <w:lang w:val="en-US" w:eastAsia="en-US" w:bidi="ar-SA"/>
+              </w:rPr>
+              <w:t>3</w:t>
+            </w:r>
+          </w:p>
+        </w:tc>
+        <w:tc>
+          <w:tcPr>
+            <w:tcW w:w="999" w:type="dxa"/>
+            <w:tcBorders/>
+          </w:tcPr>
+          <w:p>
+            <w:pPr>
+              <w:pStyle w:val="NoSpacing"/>
+              <w:widowControl/>
+              <w:suppressAutoHyphens w:val="true"/>
+              <w:spacing w:before="0" w:after="0"/>
+              <w:jc w:val="start"/>
+              <w:rPr>
+                <w:rFonts w:ascii="Calibri" w:hAnsi="Calibri" w:eastAsia="Calibri" w:cs=""/>
+                <w:kern w:val="0"/>
+                <w:sz w:val="22"/>
+                <w:szCs w:val="22"/>
+                <w:lang w:val="en-US" w:eastAsia="en-US" w:bidi="ar-SA"/>
+              </w:rPr>
+            </w:pPr>
+            <w:r>
+              <w:rPr>
+                <w:rFonts w:eastAsia="Calibri" w:cs=""/>
+                <w:kern w:val="0"/>
+                <w:sz w:val="22"/>
+                <w:szCs w:val="22"/>
+                <w:lang w:val="en-US" w:eastAsia="en-US" w:bidi="ar-SA"/>
+              </w:rPr>
+              <w:t>4</w:t>
+            </w:r>
+          </w:p>
+        </w:tc>
+        <w:tc>
+          <w:tcPr>
+            <w:tcW w:w="5107" w:type="dxa"/>
+            <w:tcBorders/>
+          </w:tcPr>
+          <w:p>
+            <w:pPr>
+              <w:pStyle w:val="NoSpacing"/>
+              <w:widowControl/>
+              <w:suppressAutoHyphens w:val="true"/>
+              <w:spacing w:before="0" w:after="0"/>
+              <w:jc w:val="start"/>
+              <w:rPr>
+                <w:rFonts w:ascii="Calibri" w:hAnsi="Calibri" w:eastAsia="Calibri" w:cs=""/>
+                <w:kern w:val="0"/>
+                <w:sz w:val="22"/>
+                <w:szCs w:val="22"/>
+                <w:lang w:val="en-US" w:eastAsia="en-US" w:bidi="ar-SA"/>
+              </w:rPr>
+            </w:pPr>
+            <w:r>
+              <w:rPr>
+                <w:rFonts w:eastAsia="Calibri" w:cs=""/>
+                <w:kern w:val="0"/>
+                <w:sz w:val="22"/>
+                <w:szCs w:val="22"/>
+                <w:lang w:val="en-US" w:eastAsia="en-US" w:bidi="ar-SA"/>
+              </w:rPr>
+              <w:t>I helped classmates understand Git concepts such as repositories, commits, and pushing changes. I guided them through solving common issues and shared what I learned from my own experience.</w:t>
             </w:r>
           </w:p>
         </w:tc>
@@ -1936,7 +2354,7 @@
         </w:trPr>
         <w:tc>
           <w:tcPr>
-            <w:tcW w:w="2854" w:type="dxa"/>
+            <w:tcW w:w="2853" w:type="dxa"/>
             <w:vMerge w:val="continue"/>
             <w:tcBorders/>
           </w:tcPr>
@@ -1944,6 +2362,7 @@
             <w:pPr>
               <w:pStyle w:val="NoSpacing"/>
               <w:widowControl/>
+              <w:suppressAutoHyphens w:val="true"/>
               <w:spacing w:before="0" w:after="0"/>
               <w:jc w:val="start"/>
               <w:rPr>
@@ -1967,7 +2386,7 @@
         </w:tc>
         <w:tc>
           <w:tcPr>
-            <w:tcW w:w="856" w:type="dxa"/>
+            <w:tcW w:w="851" w:type="dxa"/>
             <w:vMerge w:val="continue"/>
             <w:tcBorders/>
           </w:tcPr>
@@ -1975,6 +2394,7 @@
             <w:pPr>
               <w:pStyle w:val="NoSpacing"/>
               <w:widowControl/>
+              <w:suppressAutoHyphens w:val="true"/>
               <w:spacing w:before="0" w:after="0"/>
               <w:jc w:val="center"/>
               <w:rPr>
@@ -1998,13 +2418,14 @@
         </w:tc>
         <w:tc>
           <w:tcPr>
-            <w:tcW w:w="994" w:type="dxa"/>
-            <w:tcBorders/>
-          </w:tcPr>
-          <w:p>
-            <w:pPr>
-              <w:pStyle w:val="NoSpacing"/>
-              <w:widowControl/>
+            <w:tcW w:w="999" w:type="dxa"/>
+            <w:tcBorders/>
+          </w:tcPr>
+          <w:p>
+            <w:pPr>
+              <w:pStyle w:val="NoSpacing"/>
+              <w:widowControl/>
+              <w:suppressAutoHyphens w:val="true"/>
               <w:spacing w:before="0" w:after="0"/>
               <w:jc w:val="start"/>
               <w:rPr>
@@ -2023,18 +2444,21 @@
                 <w:szCs w:val="22"/>
                 <w:lang w:val="en-US" w:eastAsia="en-US" w:bidi="ar-SA"/>
               </w:rPr>
-            </w:r>
-          </w:p>
-        </w:tc>
-        <w:tc>
-          <w:tcPr>
-            <w:tcW w:w="5106" w:type="dxa"/>
-            <w:tcBorders/>
-          </w:tcPr>
-          <w:p>
-            <w:pPr>
-              <w:pStyle w:val="NoSpacing"/>
-              <w:widowControl/>
+              <w:t>5</w:t>
+            </w:r>
+          </w:p>
+        </w:tc>
+        <w:tc>
+          <w:tcPr>
+            <w:tcW w:w="5107" w:type="dxa"/>
+            <w:tcBorders/>
+          </w:tcPr>
+          <w:p>
+            <w:pPr>
+              <w:pStyle w:val="NoSpacing"/>
+              <w:widowControl/>
+              <w:suppressAutoHyphens w:val="true"/>
+              <w:bidi w:val="0"/>
               <w:spacing w:before="0" w:after="0"/>
               <w:jc w:val="start"/>
               <w:rPr>
@@ -2053,6 +2477,411 @@
                 <w:szCs w:val="22"/>
                 <w:lang w:val="en-US" w:eastAsia="en-US" w:bidi="ar-SA"/>
               </w:rPr>
+              <w:t>I also actively sought help when needed and used feedback from others and online communities to improve my project. This allowed me to learn faster and make better decisions in my application design and implementation.</w:t>
+            </w:r>
+          </w:p>
+        </w:tc>
+      </w:tr>
+      <w:tr>
+        <w:trPr>
+          <w:trHeight w:val="268" w:hRule="atLeast"/>
+        </w:trPr>
+        <w:tc>
+          <w:tcPr>
+            <w:tcW w:w="2853" w:type="dxa"/>
+            <w:vMerge w:val="restart"/>
+            <w:tcBorders/>
+          </w:tcPr>
+          <w:p>
+            <w:pPr>
+              <w:pStyle w:val="NoSpacing"/>
+              <w:widowControl/>
+              <w:suppressAutoHyphens w:val="true"/>
+              <w:spacing w:before="0" w:after="0"/>
+              <w:jc w:val="start"/>
+              <w:rPr>
+                <w:rFonts w:ascii="Calibri" w:hAnsi="Calibri" w:eastAsia="Calibri" w:cs=""/>
+                <w:kern w:val="0"/>
+                <w:sz w:val="22"/>
+                <w:szCs w:val="22"/>
+                <w:lang w:val="en-US" w:eastAsia="en-US" w:bidi="ar-SA"/>
+              </w:rPr>
+            </w:pPr>
+            <w:r>
+              <w:rPr>
+                <w:rFonts w:eastAsia="Calibri" w:cs=""/>
+                <w:kern w:val="0"/>
+                <w:sz w:val="22"/>
+                <w:szCs w:val="22"/>
+                <w:lang w:val="en-US" w:eastAsia="en-US" w:bidi="ar-SA"/>
+              </w:rPr>
+              <w:t>Use a divide and conquer approach to design solutions for programming problems.</w:t>
+            </w:r>
+          </w:p>
+        </w:tc>
+        <w:tc>
+          <w:tcPr>
+            <w:tcW w:w="851" w:type="dxa"/>
+            <w:vMerge w:val="restart"/>
+            <w:tcBorders/>
+          </w:tcPr>
+          <w:p>
+            <w:pPr>
+              <w:pStyle w:val="NoSpacing"/>
+              <w:widowControl/>
+              <w:suppressAutoHyphens w:val="true"/>
+              <w:spacing w:before="0" w:after="0"/>
+              <w:jc w:val="center"/>
+              <w:rPr>
+                <w:rFonts w:ascii="Calibri" w:hAnsi="Calibri" w:eastAsia="Calibri" w:cs=""/>
+                <w:kern w:val="0"/>
+                <w:sz w:val="22"/>
+                <w:szCs w:val="22"/>
+                <w:lang w:val="en-US" w:eastAsia="en-US" w:bidi="ar-SA"/>
+              </w:rPr>
+            </w:pPr>
+            <w:r>
+              <w:rPr>
+                <w:rFonts w:eastAsia="Calibri" w:cs=""/>
+                <w:kern w:val="0"/>
+                <w:sz w:val="22"/>
+                <w:szCs w:val="22"/>
+                <w:lang w:val="en-US" w:eastAsia="en-US" w:bidi="ar-SA"/>
+              </w:rPr>
+              <w:t>3</w:t>
+            </w:r>
+          </w:p>
+        </w:tc>
+        <w:tc>
+          <w:tcPr>
+            <w:tcW w:w="999" w:type="dxa"/>
+            <w:tcBorders/>
+          </w:tcPr>
+          <w:p>
+            <w:pPr>
+              <w:pStyle w:val="NoSpacing"/>
+              <w:widowControl/>
+              <w:suppressAutoHyphens w:val="true"/>
+              <w:spacing w:before="0" w:after="0"/>
+              <w:jc w:val="start"/>
+              <w:rPr>
+                <w:rFonts w:ascii="Calibri" w:hAnsi="Calibri" w:eastAsia="Calibri" w:cs=""/>
+                <w:kern w:val="0"/>
+                <w:sz w:val="22"/>
+                <w:szCs w:val="22"/>
+                <w:lang w:val="en-US" w:eastAsia="en-US" w:bidi="ar-SA"/>
+              </w:rPr>
+            </w:pPr>
+            <w:r>
+              <w:rPr>
+                <w:rFonts w:eastAsia="Calibri" w:cs=""/>
+                <w:kern w:val="0"/>
+                <w:sz w:val="22"/>
+                <w:szCs w:val="22"/>
+                <w:lang w:val="en-US" w:eastAsia="en-US" w:bidi="ar-SA"/>
+              </w:rPr>
+              <w:t>5</w:t>
+            </w:r>
+          </w:p>
+        </w:tc>
+        <w:tc>
+          <w:tcPr>
+            <w:tcW w:w="5107" w:type="dxa"/>
+            <w:tcBorders/>
+          </w:tcPr>
+          <w:p>
+            <w:pPr>
+              <w:pStyle w:val="NoSpacing"/>
+              <w:widowControl/>
+              <w:suppressAutoHyphens w:val="true"/>
+              <w:bidi w:val="0"/>
+              <w:spacing w:before="0" w:after="0"/>
+              <w:jc w:val="start"/>
+              <w:rPr>
+                <w:rFonts w:ascii="Calibri" w:hAnsi="Calibri" w:eastAsia="Calibri" w:cs=""/>
+                <w:kern w:val="0"/>
+                <w:sz w:val="22"/>
+                <w:szCs w:val="22"/>
+                <w:lang w:val="en-US" w:eastAsia="en-US" w:bidi="ar-SA"/>
+              </w:rPr>
+            </w:pPr>
+            <w:r>
+              <w:rPr>
+                <w:rFonts w:eastAsia="Calibri" w:cs=""/>
+                <w:kern w:val="0"/>
+                <w:sz w:val="22"/>
+                <w:szCs w:val="22"/>
+                <w:lang w:val="en-US" w:eastAsia="en-US" w:bidi="ar-SA"/>
+              </w:rPr>
+              <w:t>I applied a divide-and-conquer approach by breaking my application into smaller modules such as API handling, rendering lists, detail views, and watchlist management. This made the code easier to understand and maintain.</w:t>
+            </w:r>
+          </w:p>
+        </w:tc>
+      </w:tr>
+      <w:tr>
+        <w:trPr>
+          <w:trHeight w:val="268" w:hRule="atLeast"/>
+        </w:trPr>
+        <w:tc>
+          <w:tcPr>
+            <w:tcW w:w="2853" w:type="dxa"/>
+            <w:vMerge w:val="continue"/>
+            <w:tcBorders/>
+          </w:tcPr>
+          <w:p>
+            <w:pPr>
+              <w:pStyle w:val="NoSpacing"/>
+              <w:widowControl/>
+              <w:suppressAutoHyphens w:val="true"/>
+              <w:spacing w:before="0" w:after="0"/>
+              <w:jc w:val="start"/>
+              <w:rPr>
+                <w:rFonts w:ascii="Calibri" w:hAnsi="Calibri" w:eastAsia="Calibri" w:cs=""/>
+                <w:kern w:val="0"/>
+                <w:sz w:val="22"/>
+                <w:szCs w:val="22"/>
+                <w:lang w:val="en-US" w:eastAsia="en-US" w:bidi="ar-SA"/>
+              </w:rPr>
+            </w:pPr>
+            <w:r>
+              <w:rPr>
+                <w:rFonts w:eastAsia="Calibri" w:cs=""/>
+                <w:kern w:val="0"/>
+                <w:sz w:val="22"/>
+                <w:szCs w:val="22"/>
+                <w:lang w:val="en-US" w:eastAsia="en-US" w:bidi="ar-SA"/>
+              </w:rPr>
+            </w:r>
+          </w:p>
+        </w:tc>
+        <w:tc>
+          <w:tcPr>
+            <w:tcW w:w="851" w:type="dxa"/>
+            <w:vMerge w:val="continue"/>
+            <w:tcBorders/>
+          </w:tcPr>
+          <w:p>
+            <w:pPr>
+              <w:pStyle w:val="NoSpacing"/>
+              <w:widowControl/>
+              <w:suppressAutoHyphens w:val="true"/>
+              <w:spacing w:before="0" w:after="0"/>
+              <w:jc w:val="center"/>
+              <w:rPr>
+                <w:rFonts w:ascii="Calibri" w:hAnsi="Calibri" w:eastAsia="Calibri" w:cs=""/>
+                <w:kern w:val="0"/>
+                <w:sz w:val="22"/>
+                <w:szCs w:val="22"/>
+                <w:lang w:val="en-US" w:eastAsia="en-US" w:bidi="ar-SA"/>
+              </w:rPr>
+            </w:pPr>
+            <w:r>
+              <w:rPr>
+                <w:rFonts w:eastAsia="Calibri" w:cs=""/>
+                <w:kern w:val="0"/>
+                <w:sz w:val="22"/>
+                <w:szCs w:val="22"/>
+                <w:lang w:val="en-US" w:eastAsia="en-US" w:bidi="ar-SA"/>
+              </w:rPr>
+            </w:r>
+          </w:p>
+        </w:tc>
+        <w:tc>
+          <w:tcPr>
+            <w:tcW w:w="999" w:type="dxa"/>
+            <w:tcBorders/>
+          </w:tcPr>
+          <w:p>
+            <w:pPr>
+              <w:pStyle w:val="NoSpacing"/>
+              <w:widowControl/>
+              <w:suppressAutoHyphens w:val="true"/>
+              <w:spacing w:before="0" w:after="0"/>
+              <w:jc w:val="start"/>
+              <w:rPr>
+                <w:rFonts w:ascii="Calibri" w:hAnsi="Calibri" w:eastAsia="Calibri" w:cs=""/>
+                <w:kern w:val="0"/>
+                <w:sz w:val="22"/>
+                <w:szCs w:val="22"/>
+                <w:lang w:val="en-US" w:eastAsia="en-US" w:bidi="ar-SA"/>
+              </w:rPr>
+            </w:pPr>
+            <w:r>
+              <w:rPr>
+                <w:rFonts w:eastAsia="Calibri" w:cs=""/>
+                <w:kern w:val="0"/>
+                <w:sz w:val="22"/>
+                <w:szCs w:val="22"/>
+                <w:lang w:val="en-US" w:eastAsia="en-US" w:bidi="ar-SA"/>
+              </w:rPr>
+              <w:t>5</w:t>
+            </w:r>
+          </w:p>
+        </w:tc>
+        <w:tc>
+          <w:tcPr>
+            <w:tcW w:w="5107" w:type="dxa"/>
+            <w:tcBorders/>
+          </w:tcPr>
+          <w:p>
+            <w:pPr>
+              <w:pStyle w:val="NoSpacing"/>
+              <w:widowControl/>
+              <w:suppressAutoHyphens w:val="true"/>
+              <w:spacing w:before="0" w:after="0"/>
+              <w:jc w:val="start"/>
+              <w:rPr>
+                <w:rFonts w:ascii="Calibri" w:hAnsi="Calibri" w:eastAsia="Calibri" w:cs=""/>
+                <w:kern w:val="0"/>
+                <w:sz w:val="22"/>
+                <w:szCs w:val="22"/>
+                <w:lang w:val="en-US" w:eastAsia="en-US" w:bidi="ar-SA"/>
+              </w:rPr>
+            </w:pPr>
+            <w:r>
+              <w:rPr>
+                <w:rFonts w:eastAsia="Calibri" w:cs=""/>
+                <w:kern w:val="0"/>
+                <w:sz w:val="22"/>
+                <w:szCs w:val="22"/>
+                <w:lang w:val="en-US" w:eastAsia="en-US" w:bidi="ar-SA"/>
+              </w:rPr>
+              <w:t>I also divided features into smaller development tasks using Trello, which allowed me to plan and track progress effectively. This approach helped me solve complex problems step by step instead of trying to handle everything at once.</w:t>
+            </w:r>
+          </w:p>
+        </w:tc>
+      </w:tr>
+      <w:tr>
+        <w:trPr>
+          <w:trHeight w:val="1140" w:hRule="atLeast"/>
+        </w:trPr>
+        <w:tc>
+          <w:tcPr>
+            <w:tcW w:w="2853" w:type="dxa"/>
+            <w:vMerge w:val="restart"/>
+            <w:tcBorders/>
+          </w:tcPr>
+          <w:p>
+            <w:pPr>
+              <w:pStyle w:val="NoSpacing"/>
+              <w:widowControl/>
+              <w:suppressAutoHyphens w:val="true"/>
+              <w:spacing w:before="0" w:after="0"/>
+              <w:jc w:val="start"/>
+              <w:rPr>
+                <w:rFonts w:ascii="Calibri" w:hAnsi="Calibri" w:eastAsia="Calibri" w:cs=""/>
+                <w:kern w:val="0"/>
+                <w:sz w:val="22"/>
+                <w:szCs w:val="22"/>
+                <w:lang w:val="en-US" w:eastAsia="en-US" w:bidi="ar-SA"/>
+              </w:rPr>
+            </w:pPr>
+            <w:r>
+              <w:rPr>
+                <w:rFonts w:eastAsia="Calibri" w:cs=""/>
+                <w:kern w:val="0"/>
+                <w:sz w:val="22"/>
+                <w:szCs w:val="22"/>
+                <w:lang w:val="en-US" w:eastAsia="en-US" w:bidi="ar-SA"/>
+              </w:rPr>
+              <w:t>Finding and troubleshooting bugs you and others will have in the code you write.</w:t>
+            </w:r>
+          </w:p>
+        </w:tc>
+        <w:tc>
+          <w:tcPr>
+            <w:tcW w:w="851" w:type="dxa"/>
+            <w:vMerge w:val="restart"/>
+            <w:tcBorders/>
+          </w:tcPr>
+          <w:p>
+            <w:pPr>
+              <w:pStyle w:val="NoSpacing"/>
+              <w:widowControl/>
+              <w:suppressAutoHyphens w:val="true"/>
+              <w:spacing w:before="0" w:after="0"/>
+              <w:jc w:val="center"/>
+              <w:rPr>
+                <w:rFonts w:ascii="Calibri" w:hAnsi="Calibri" w:eastAsia="Calibri" w:cs=""/>
+                <w:kern w:val="0"/>
+                <w:sz w:val="22"/>
+                <w:szCs w:val="22"/>
+                <w:lang w:val="en-US" w:eastAsia="en-US" w:bidi="ar-SA"/>
+              </w:rPr>
+            </w:pPr>
+            <w:r>
+              <w:rPr>
+                <w:rFonts w:eastAsia="Calibri" w:cs=""/>
+                <w:kern w:val="0"/>
+                <w:sz w:val="22"/>
+                <w:szCs w:val="22"/>
+                <w:lang w:val="en-US" w:eastAsia="en-US" w:bidi="ar-SA"/>
+              </w:rPr>
+              <w:t>3</w:t>
+            </w:r>
+          </w:p>
+        </w:tc>
+        <w:tc>
+          <w:tcPr>
+            <w:tcW w:w="999" w:type="dxa"/>
+            <w:tcBorders/>
+          </w:tcPr>
+          <w:p>
+            <w:pPr>
+              <w:pStyle w:val="NoSpacing"/>
+              <w:widowControl/>
+              <w:suppressAutoHyphens w:val="true"/>
+              <w:spacing w:before="0" w:after="0"/>
+              <w:jc w:val="start"/>
+              <w:rPr>
+                <w:rFonts w:ascii="Calibri" w:hAnsi="Calibri" w:eastAsia="Calibri" w:cs=""/>
+                <w:kern w:val="0"/>
+                <w:sz w:val="22"/>
+                <w:szCs w:val="22"/>
+                <w:lang w:val="en-US" w:eastAsia="en-US" w:bidi="ar-SA"/>
+              </w:rPr>
+            </w:pPr>
+            <w:r>
+              <w:rPr>
+                <w:rFonts w:eastAsia="Calibri" w:cs=""/>
+                <w:kern w:val="0"/>
+                <w:sz w:val="22"/>
+                <w:szCs w:val="22"/>
+                <w:lang w:val="en-US" w:eastAsia="en-US" w:bidi="ar-SA"/>
+              </w:rPr>
+              <w:t>4</w:t>
+            </w:r>
+          </w:p>
+        </w:tc>
+        <w:tc>
+          <w:tcPr>
+            <w:tcW w:w="5107" w:type="dxa"/>
+            <w:tcBorders/>
+          </w:tcPr>
+          <w:p>
+            <w:pPr>
+              <w:pStyle w:val="NoSpacing"/>
+              <w:widowControl/>
+              <w:suppressAutoHyphens w:val="true"/>
+              <w:spacing w:before="0" w:after="0"/>
+              <w:jc w:val="start"/>
+              <w:rPr>
+                <w:rFonts w:ascii="Calibri" w:hAnsi="Calibri" w:eastAsia="Calibri" w:cs=""/>
+                <w:kern w:val="0"/>
+                <w:sz w:val="22"/>
+                <w:szCs w:val="22"/>
+                <w:lang w:val="en-US" w:eastAsia="en-US" w:bidi="ar-SA"/>
+              </w:rPr>
+            </w:pPr>
+            <w:r>
+              <w:rPr>
+                <w:rFonts w:eastAsia="Calibri" w:cs=""/>
+                <w:kern w:val="0"/>
+                <w:sz w:val="22"/>
+                <w:szCs w:val="22"/>
+                <w:lang w:val="en-US" w:eastAsia="en-US" w:bidi="ar-SA"/>
+              </w:rPr>
+              <w:t>I encountered several issues during development, including problems with API requests, local storage, and event handling. I used debugging techniques such as console logs and step-by-step testing to identify the root cause of errors.</w:t>
             </w:r>
           </w:p>
         </w:tc>
@@ -2063,14 +2892,15 @@
         </w:trPr>
         <w:tc>
           <w:tcPr>
-            <w:tcW w:w="2854" w:type="dxa"/>
-            <w:vMerge w:val="restart"/>
-            <w:tcBorders/>
-          </w:tcPr>
-          <w:p>
-            <w:pPr>
-              <w:pStyle w:val="NoSpacing"/>
-              <w:widowControl/>
+            <w:tcW w:w="2853" w:type="dxa"/>
+            <w:vMerge w:val="continue"/>
+            <w:tcBorders/>
+          </w:tcPr>
+          <w:p>
+            <w:pPr>
+              <w:pStyle w:val="NoSpacing"/>
+              <w:widowControl/>
+              <w:suppressAutoHyphens w:val="true"/>
               <w:spacing w:before="0" w:after="0"/>
               <w:jc w:val="start"/>
               <w:rPr>
@@ -2089,22 +2919,22 @@
                 <w:szCs w:val="22"/>
                 <w:lang w:val="en-US" w:eastAsia="en-US" w:bidi="ar-SA"/>
               </w:rPr>
-              <w:t>Become more dexterous at exploring your environment.</w:t>
-            </w:r>
-          </w:p>
-        </w:tc>
-        <w:tc>
-          <w:tcPr>
-            <w:tcW w:w="856" w:type="dxa"/>
-            <w:vMerge w:val="restart"/>
-            <w:tcBorders/>
-          </w:tcPr>
-          <w:p>
-            <w:pPr>
-              <w:pStyle w:val="NoSpacing"/>
-              <w:widowControl/>
-              <w:spacing w:before="0" w:after="0"/>
-              <w:jc w:val="center"/>
+            </w:r>
+          </w:p>
+        </w:tc>
+        <w:tc>
+          <w:tcPr>
+            <w:tcW w:w="851" w:type="dxa"/>
+            <w:vMerge w:val="continue"/>
+            <w:tcBorders/>
+          </w:tcPr>
+          <w:p>
+            <w:pPr>
+              <w:pStyle w:val="NoSpacing"/>
+              <w:widowControl/>
+              <w:suppressAutoHyphens w:val="true"/>
+              <w:spacing w:before="0" w:after="0"/>
+              <w:jc w:val="start"/>
               <w:rPr>
                 <w:rFonts w:ascii="Calibri" w:hAnsi="Calibri" w:eastAsia="Calibri" w:cs=""/>
                 <w:kern w:val="0"/>
@@ -2121,19 +2951,19 @@
                 <w:szCs w:val="22"/>
                 <w:lang w:val="en-US" w:eastAsia="en-US" w:bidi="ar-SA"/>
               </w:rPr>
-              <w:t>2</w:t>
-            </w:r>
-          </w:p>
-        </w:tc>
-        <w:tc>
-          <w:tcPr>
-            <w:tcW w:w="994" w:type="dxa"/>
-            <w:tcBorders/>
-          </w:tcPr>
-          <w:p>
-            <w:pPr>
-              <w:pStyle w:val="NoSpacing"/>
-              <w:widowControl/>
+            </w:r>
+          </w:p>
+        </w:tc>
+        <w:tc>
+          <w:tcPr>
+            <w:tcW w:w="999" w:type="dxa"/>
+            <w:tcBorders/>
+          </w:tcPr>
+          <w:p>
+            <w:pPr>
+              <w:pStyle w:val="NoSpacing"/>
+              <w:widowControl/>
+              <w:suppressAutoHyphens w:val="true"/>
               <w:spacing w:before="0" w:after="0"/>
               <w:jc w:val="start"/>
               <w:rPr>
@@ -2152,19 +2982,20 @@
                 <w:szCs w:val="22"/>
                 <w:lang w:val="en-US" w:eastAsia="en-US" w:bidi="ar-SA"/>
               </w:rPr>
-              <w:t>3</w:t>
-            </w:r>
-          </w:p>
-        </w:tc>
-        <w:tc>
-          <w:tcPr>
-            <w:tcW w:w="5106" w:type="dxa"/>
-            <w:tcBorders/>
-          </w:tcPr>
-          <w:p>
-            <w:pPr>
-              <w:pStyle w:val="NoSpacing"/>
-              <w:widowControl/>
+              <w:t>5</w:t>
+            </w:r>
+          </w:p>
+        </w:tc>
+        <w:tc>
+          <w:tcPr>
+            <w:tcW w:w="5107" w:type="dxa"/>
+            <w:tcBorders/>
+          </w:tcPr>
+          <w:p>
+            <w:pPr>
+              <w:pStyle w:val="NoSpacing"/>
+              <w:widowControl/>
+              <w:suppressAutoHyphens w:val="true"/>
               <w:spacing w:before="0" w:after="0"/>
               <w:jc w:val="start"/>
               <w:rPr>
@@ -2183,1424 +3014,7 @@
                 <w:szCs w:val="22"/>
                 <w:lang w:val="en-US" w:eastAsia="en-US" w:bidi="ar-SA"/>
               </w:rPr>
-              <w:t>I learned how APIs work by watching tutorials and reading documentation. I explored how to use Fetch with async/await to retrieve data.</w:t>
-            </w:r>
-          </w:p>
-        </w:tc>
-      </w:tr>
-      <w:tr>
-        <w:trPr>
-          <w:trHeight w:val="279" w:hRule="atLeast"/>
-        </w:trPr>
-        <w:tc>
-          <w:tcPr>
-            <w:tcW w:w="2854" w:type="dxa"/>
-            <w:vMerge w:val="continue"/>
-            <w:tcBorders/>
-          </w:tcPr>
-          <w:p>
-            <w:pPr>
-              <w:pStyle w:val="NoSpacing"/>
-              <w:widowControl/>
-              <w:spacing w:before="0" w:after="0"/>
-              <w:jc w:val="start"/>
-              <w:rPr>
-                <w:rFonts w:ascii="Calibri" w:hAnsi="Calibri" w:eastAsia="Calibri" w:cs=""/>
-                <w:kern w:val="0"/>
-                <w:sz w:val="22"/>
-                <w:szCs w:val="22"/>
-                <w:lang w:val="en-US" w:eastAsia="en-US" w:bidi="ar-SA"/>
-              </w:rPr>
-            </w:pPr>
-            <w:r>
-              <w:rPr>
-                <w:rFonts w:eastAsia="Calibri" w:cs=""/>
-                <w:kern w:val="0"/>
-                <w:sz w:val="22"/>
-                <w:szCs w:val="22"/>
-                <w:lang w:val="en-US" w:eastAsia="en-US" w:bidi="ar-SA"/>
-              </w:rPr>
-            </w:r>
-          </w:p>
-        </w:tc>
-        <w:tc>
-          <w:tcPr>
-            <w:tcW w:w="856" w:type="dxa"/>
-            <w:vMerge w:val="continue"/>
-            <w:tcBorders/>
-          </w:tcPr>
-          <w:p>
-            <w:pPr>
-              <w:pStyle w:val="NoSpacing"/>
-              <w:widowControl/>
-              <w:spacing w:before="0" w:after="0"/>
-              <w:jc w:val="center"/>
-              <w:rPr>
-                <w:rFonts w:ascii="Calibri" w:hAnsi="Calibri" w:eastAsia="Calibri" w:cs=""/>
-                <w:kern w:val="0"/>
-                <w:sz w:val="22"/>
-                <w:szCs w:val="22"/>
-                <w:lang w:val="en-US" w:eastAsia="en-US" w:bidi="ar-SA"/>
-              </w:rPr>
-            </w:pPr>
-            <w:r>
-              <w:rPr>
-                <w:rFonts w:eastAsia="Calibri" w:cs=""/>
-                <w:kern w:val="0"/>
-                <w:sz w:val="22"/>
-                <w:szCs w:val="22"/>
-                <w:lang w:val="en-US" w:eastAsia="en-US" w:bidi="ar-SA"/>
-              </w:rPr>
-            </w:r>
-          </w:p>
-        </w:tc>
-        <w:tc>
-          <w:tcPr>
-            <w:tcW w:w="994" w:type="dxa"/>
-            <w:tcBorders/>
-          </w:tcPr>
-          <w:p>
-            <w:pPr>
-              <w:pStyle w:val="NoSpacing"/>
-              <w:widowControl/>
-              <w:spacing w:before="0" w:after="0"/>
-              <w:jc w:val="start"/>
-              <w:rPr>
-                <w:rFonts w:ascii="Calibri" w:hAnsi="Calibri" w:eastAsia="Calibri" w:cs=""/>
-                <w:kern w:val="0"/>
-                <w:sz w:val="22"/>
-                <w:szCs w:val="22"/>
-                <w:lang w:val="en-US" w:eastAsia="en-US" w:bidi="ar-SA"/>
-              </w:rPr>
-            </w:pPr>
-            <w:r>
-              <w:rPr>
-                <w:rFonts w:eastAsia="Calibri" w:cs=""/>
-                <w:kern w:val="0"/>
-                <w:sz w:val="22"/>
-                <w:szCs w:val="22"/>
-                <w:lang w:val="en-US" w:eastAsia="en-US" w:bidi="ar-SA"/>
-              </w:rPr>
-              <w:t>5</w:t>
-            </w:r>
-          </w:p>
-        </w:tc>
-        <w:tc>
-          <w:tcPr>
-            <w:tcW w:w="5106" w:type="dxa"/>
-            <w:tcBorders/>
-          </w:tcPr>
-          <w:p>
-            <w:pPr>
-              <w:pStyle w:val="NoSpacing"/>
-              <w:widowControl/>
-              <w:spacing w:before="0" w:after="0"/>
-              <w:jc w:val="start"/>
-              <w:rPr>
-                <w:rFonts w:ascii="Calibri" w:hAnsi="Calibri" w:eastAsia="Calibri" w:cs=""/>
-                <w:kern w:val="0"/>
-                <w:sz w:val="22"/>
-                <w:szCs w:val="22"/>
-                <w:lang w:val="en-US" w:eastAsia="en-US" w:bidi="ar-SA"/>
-              </w:rPr>
-            </w:pPr>
-            <w:r>
-              <w:rPr>
-                <w:rFonts w:eastAsia="Calibri" w:cs=""/>
-                <w:kern w:val="0"/>
-                <w:sz w:val="22"/>
-                <w:szCs w:val="22"/>
-                <w:lang w:val="en-US" w:eastAsia="en-US" w:bidi="ar-SA"/>
-              </w:rPr>
-              <w:t>I used AI tools and online resources to better understand how to structure my project and organize modules for scalability.</w:t>
-            </w:r>
-          </w:p>
-        </w:tc>
-      </w:tr>
-      <w:tr>
-        <w:trPr>
-          <w:trHeight w:val="279" w:hRule="atLeast"/>
-        </w:trPr>
-        <w:tc>
-          <w:tcPr>
-            <w:tcW w:w="2854" w:type="dxa"/>
-            <w:vMerge w:val="continue"/>
-            <w:tcBorders/>
-          </w:tcPr>
-          <w:p>
-            <w:pPr>
-              <w:pStyle w:val="NoSpacing"/>
-              <w:widowControl/>
-              <w:spacing w:before="0" w:after="0"/>
-              <w:jc w:val="start"/>
-              <w:rPr>
-                <w:rFonts w:ascii="Calibri" w:hAnsi="Calibri" w:eastAsia="Calibri" w:cs=""/>
-                <w:kern w:val="0"/>
-                <w:sz w:val="22"/>
-                <w:szCs w:val="22"/>
-                <w:lang w:val="en-US" w:eastAsia="en-US" w:bidi="ar-SA"/>
-              </w:rPr>
-            </w:pPr>
-            <w:r>
-              <w:rPr>
-                <w:rFonts w:eastAsia="Calibri" w:cs=""/>
-                <w:kern w:val="0"/>
-                <w:sz w:val="22"/>
-                <w:szCs w:val="22"/>
-                <w:lang w:val="en-US" w:eastAsia="en-US" w:bidi="ar-SA"/>
-              </w:rPr>
-            </w:r>
-          </w:p>
-        </w:tc>
-        <w:tc>
-          <w:tcPr>
-            <w:tcW w:w="856" w:type="dxa"/>
-            <w:vMerge w:val="continue"/>
-            <w:tcBorders/>
-          </w:tcPr>
-          <w:p>
-            <w:pPr>
-              <w:pStyle w:val="NoSpacing"/>
-              <w:widowControl/>
-              <w:spacing w:before="0" w:after="0"/>
-              <w:jc w:val="center"/>
-              <w:rPr>
-                <w:rFonts w:ascii="Calibri" w:hAnsi="Calibri" w:eastAsia="Calibri" w:cs=""/>
-                <w:kern w:val="0"/>
-                <w:sz w:val="22"/>
-                <w:szCs w:val="22"/>
-                <w:lang w:val="en-US" w:eastAsia="en-US" w:bidi="ar-SA"/>
-              </w:rPr>
-            </w:pPr>
-            <w:r>
-              <w:rPr>
-                <w:rFonts w:eastAsia="Calibri" w:cs=""/>
-                <w:kern w:val="0"/>
-                <w:sz w:val="22"/>
-                <w:szCs w:val="22"/>
-                <w:lang w:val="en-US" w:eastAsia="en-US" w:bidi="ar-SA"/>
-              </w:rPr>
-            </w:r>
-          </w:p>
-        </w:tc>
-        <w:tc>
-          <w:tcPr>
-            <w:tcW w:w="994" w:type="dxa"/>
-            <w:tcBorders/>
-          </w:tcPr>
-          <w:p>
-            <w:pPr>
-              <w:pStyle w:val="NoSpacing"/>
-              <w:widowControl/>
-              <w:spacing w:before="0" w:after="0"/>
-              <w:jc w:val="start"/>
-              <w:rPr>
-                <w:rFonts w:ascii="Calibri" w:hAnsi="Calibri" w:eastAsia="Calibri" w:cs=""/>
-                <w:kern w:val="0"/>
-                <w:sz w:val="22"/>
-                <w:szCs w:val="22"/>
-                <w:lang w:val="en-US" w:eastAsia="en-US" w:bidi="ar-SA"/>
-              </w:rPr>
-            </w:pPr>
-            <w:r>
-              <w:rPr>
-                <w:rFonts w:eastAsia="Calibri" w:cs=""/>
-                <w:kern w:val="0"/>
-                <w:sz w:val="22"/>
-                <w:szCs w:val="22"/>
-                <w:lang w:val="en-US" w:eastAsia="en-US" w:bidi="ar-SA"/>
-              </w:rPr>
-            </w:r>
-          </w:p>
-        </w:tc>
-        <w:tc>
-          <w:tcPr>
-            <w:tcW w:w="5106" w:type="dxa"/>
-            <w:tcBorders/>
-          </w:tcPr>
-          <w:p>
-            <w:pPr>
-              <w:pStyle w:val="NoSpacing"/>
-              <w:widowControl/>
-              <w:spacing w:before="0" w:after="0"/>
-              <w:jc w:val="start"/>
-              <w:rPr>
-                <w:rFonts w:ascii="Calibri" w:hAnsi="Calibri" w:eastAsia="Calibri" w:cs=""/>
-                <w:kern w:val="0"/>
-                <w:sz w:val="22"/>
-                <w:szCs w:val="22"/>
-                <w:lang w:val="en-US" w:eastAsia="en-US" w:bidi="ar-SA"/>
-              </w:rPr>
-            </w:pPr>
-            <w:r>
-              <w:rPr>
-                <w:rFonts w:eastAsia="Calibri" w:cs=""/>
-                <w:kern w:val="0"/>
-                <w:sz w:val="22"/>
-                <w:szCs w:val="22"/>
-                <w:lang w:val="en-US" w:eastAsia="en-US" w:bidi="ar-SA"/>
-              </w:rPr>
-            </w:r>
-          </w:p>
-        </w:tc>
-      </w:tr>
-      <w:tr>
-        <w:trPr>
-          <w:trHeight w:val="279" w:hRule="atLeast"/>
-        </w:trPr>
-        <w:tc>
-          <w:tcPr>
-            <w:tcW w:w="2854" w:type="dxa"/>
-            <w:vMerge w:val="restart"/>
-            <w:tcBorders/>
-          </w:tcPr>
-          <w:p>
-            <w:pPr>
-              <w:pStyle w:val="NoSpacing"/>
-              <w:widowControl/>
-              <w:spacing w:before="0" w:after="0"/>
-              <w:jc w:val="start"/>
-              <w:rPr>
-                <w:rFonts w:ascii="Calibri" w:hAnsi="Calibri" w:eastAsia="Calibri" w:cs=""/>
-                <w:kern w:val="0"/>
-                <w:sz w:val="22"/>
-                <w:szCs w:val="22"/>
-                <w:lang w:val="en-US" w:eastAsia="en-US" w:bidi="ar-SA"/>
-              </w:rPr>
-            </w:pPr>
-            <w:r>
-              <w:rPr>
-                <w:rFonts w:eastAsia="Calibri" w:cs=""/>
-                <w:kern w:val="0"/>
-                <w:sz w:val="22"/>
-                <w:szCs w:val="22"/>
-                <w:lang w:val="en-US" w:eastAsia="en-US" w:bidi="ar-SA"/>
-              </w:rPr>
-              <w:t>Become a person who enjoys helping and learning from others.</w:t>
-            </w:r>
-          </w:p>
-        </w:tc>
-        <w:tc>
-          <w:tcPr>
-            <w:tcW w:w="856" w:type="dxa"/>
-            <w:vMerge w:val="restart"/>
-            <w:tcBorders/>
-          </w:tcPr>
-          <w:p>
-            <w:pPr>
-              <w:pStyle w:val="NoSpacing"/>
-              <w:widowControl/>
-              <w:spacing w:before="0" w:after="0"/>
-              <w:jc w:val="center"/>
-              <w:rPr>
-                <w:rFonts w:ascii="Calibri" w:hAnsi="Calibri" w:eastAsia="Calibri" w:cs=""/>
-                <w:kern w:val="0"/>
-                <w:sz w:val="22"/>
-                <w:szCs w:val="22"/>
-                <w:lang w:val="en-US" w:eastAsia="en-US" w:bidi="ar-SA"/>
-              </w:rPr>
-            </w:pPr>
-            <w:r>
-              <w:rPr>
-                <w:rFonts w:eastAsia="Calibri" w:cs=""/>
-                <w:kern w:val="0"/>
-                <w:sz w:val="22"/>
-                <w:szCs w:val="22"/>
-                <w:lang w:val="en-US" w:eastAsia="en-US" w:bidi="ar-SA"/>
-              </w:rPr>
-              <w:t>2</w:t>
-            </w:r>
-          </w:p>
-        </w:tc>
-        <w:tc>
-          <w:tcPr>
-            <w:tcW w:w="994" w:type="dxa"/>
-            <w:tcBorders/>
-          </w:tcPr>
-          <w:p>
-            <w:pPr>
-              <w:pStyle w:val="NoSpacing"/>
-              <w:widowControl/>
-              <w:spacing w:before="0" w:after="0"/>
-              <w:jc w:val="start"/>
-              <w:rPr>
-                <w:rFonts w:ascii="Calibri" w:hAnsi="Calibri" w:eastAsia="Calibri" w:cs=""/>
-                <w:kern w:val="0"/>
-                <w:sz w:val="22"/>
-                <w:szCs w:val="22"/>
-                <w:lang w:val="en-US" w:eastAsia="en-US" w:bidi="ar-SA"/>
-              </w:rPr>
-            </w:pPr>
-            <w:r>
-              <w:rPr>
-                <w:rFonts w:eastAsia="Calibri" w:cs=""/>
-                <w:kern w:val="0"/>
-                <w:sz w:val="22"/>
-                <w:szCs w:val="22"/>
-                <w:lang w:val="en-US" w:eastAsia="en-US" w:bidi="ar-SA"/>
-              </w:rPr>
-              <w:t>4</w:t>
-            </w:r>
-          </w:p>
-        </w:tc>
-        <w:tc>
-          <w:tcPr>
-            <w:tcW w:w="5106" w:type="dxa"/>
-            <w:tcBorders/>
-          </w:tcPr>
-          <w:p>
-            <w:pPr>
-              <w:pStyle w:val="NoSpacing"/>
-              <w:widowControl/>
-              <w:spacing w:before="0" w:after="0"/>
-              <w:jc w:val="start"/>
-              <w:rPr>
-                <w:rFonts w:ascii="Calibri" w:hAnsi="Calibri" w:eastAsia="Calibri" w:cs=""/>
-                <w:kern w:val="0"/>
-                <w:sz w:val="22"/>
-                <w:szCs w:val="22"/>
-                <w:lang w:val="en-US" w:eastAsia="en-US" w:bidi="ar-SA"/>
-              </w:rPr>
-            </w:pPr>
-            <w:r>
-              <w:rPr>
-                <w:rFonts w:eastAsia="Calibri" w:cs=""/>
-                <w:kern w:val="0"/>
-                <w:sz w:val="22"/>
-                <w:szCs w:val="22"/>
-                <w:lang w:val="en-US" w:eastAsia="en-US" w:bidi="ar-SA"/>
-              </w:rPr>
-              <w:t>I helped classmates with Git-related issues, especially understanding how to manage repositories and basic commands.</w:t>
-            </w:r>
-          </w:p>
-        </w:tc>
-      </w:tr>
-      <w:tr>
-        <w:trPr>
-          <w:trHeight w:val="268" w:hRule="atLeast"/>
-        </w:trPr>
-        <w:tc>
-          <w:tcPr>
-            <w:tcW w:w="2854" w:type="dxa"/>
-            <w:vMerge w:val="continue"/>
-            <w:tcBorders/>
-          </w:tcPr>
-          <w:p>
-            <w:pPr>
-              <w:pStyle w:val="NoSpacing"/>
-              <w:widowControl/>
-              <w:spacing w:before="0" w:after="0"/>
-              <w:jc w:val="start"/>
-              <w:rPr>
-                <w:rFonts w:ascii="Calibri" w:hAnsi="Calibri" w:eastAsia="Calibri" w:cs=""/>
-                <w:kern w:val="0"/>
-                <w:sz w:val="22"/>
-                <w:szCs w:val="22"/>
-                <w:lang w:val="en-US" w:eastAsia="en-US" w:bidi="ar-SA"/>
-              </w:rPr>
-            </w:pPr>
-            <w:r>
-              <w:rPr>
-                <w:rFonts w:eastAsia="Calibri" w:cs=""/>
-                <w:kern w:val="0"/>
-                <w:sz w:val="22"/>
-                <w:szCs w:val="22"/>
-                <w:lang w:val="en-US" w:eastAsia="en-US" w:bidi="ar-SA"/>
-              </w:rPr>
-            </w:r>
-          </w:p>
-        </w:tc>
-        <w:tc>
-          <w:tcPr>
-            <w:tcW w:w="856" w:type="dxa"/>
-            <w:vMerge w:val="continue"/>
-            <w:tcBorders/>
-          </w:tcPr>
-          <w:p>
-            <w:pPr>
-              <w:pStyle w:val="NoSpacing"/>
-              <w:widowControl/>
-              <w:spacing w:before="0" w:after="0"/>
-              <w:jc w:val="center"/>
-              <w:rPr>
-                <w:rFonts w:ascii="Calibri" w:hAnsi="Calibri" w:eastAsia="Calibri" w:cs=""/>
-                <w:kern w:val="0"/>
-                <w:sz w:val="22"/>
-                <w:szCs w:val="22"/>
-                <w:lang w:val="en-US" w:eastAsia="en-US" w:bidi="ar-SA"/>
-              </w:rPr>
-            </w:pPr>
-            <w:r>
-              <w:rPr>
-                <w:rFonts w:eastAsia="Calibri" w:cs=""/>
-                <w:kern w:val="0"/>
-                <w:sz w:val="22"/>
-                <w:szCs w:val="22"/>
-                <w:lang w:val="en-US" w:eastAsia="en-US" w:bidi="ar-SA"/>
-              </w:rPr>
-            </w:r>
-          </w:p>
-        </w:tc>
-        <w:tc>
-          <w:tcPr>
-            <w:tcW w:w="994" w:type="dxa"/>
-            <w:tcBorders/>
-          </w:tcPr>
-          <w:p>
-            <w:pPr>
-              <w:pStyle w:val="NoSpacing"/>
-              <w:widowControl/>
-              <w:spacing w:before="0" w:after="0"/>
-              <w:jc w:val="start"/>
-              <w:rPr>
-                <w:rFonts w:ascii="Calibri" w:hAnsi="Calibri" w:eastAsia="Calibri" w:cs=""/>
-                <w:kern w:val="0"/>
-                <w:sz w:val="22"/>
-                <w:szCs w:val="22"/>
-                <w:lang w:val="en-US" w:eastAsia="en-US" w:bidi="ar-SA"/>
-              </w:rPr>
-            </w:pPr>
-            <w:r>
-              <w:rPr>
-                <w:rFonts w:eastAsia="Calibri" w:cs=""/>
-                <w:kern w:val="0"/>
-                <w:sz w:val="22"/>
-                <w:szCs w:val="22"/>
-                <w:lang w:val="en-US" w:eastAsia="en-US" w:bidi="ar-SA"/>
-              </w:rPr>
-              <w:t>5</w:t>
-            </w:r>
-          </w:p>
-        </w:tc>
-        <w:tc>
-          <w:tcPr>
-            <w:tcW w:w="5106" w:type="dxa"/>
-            <w:tcBorders/>
-          </w:tcPr>
-          <w:p>
-            <w:pPr>
-              <w:pStyle w:val="NoSpacing"/>
-              <w:widowControl/>
-              <w:spacing w:before="0" w:after="0"/>
-              <w:jc w:val="start"/>
-              <w:rPr>
-                <w:rFonts w:ascii="Calibri" w:hAnsi="Calibri" w:eastAsia="Calibri" w:cs=""/>
-                <w:kern w:val="0"/>
-                <w:sz w:val="22"/>
-                <w:szCs w:val="22"/>
-                <w:lang w:val="en-US" w:eastAsia="en-US" w:bidi="ar-SA"/>
-              </w:rPr>
-            </w:pPr>
-            <w:r>
-              <w:rPr>
-                <w:rFonts w:eastAsia="Calibri" w:cs=""/>
-                <w:kern w:val="0"/>
-                <w:sz w:val="22"/>
-                <w:szCs w:val="22"/>
-                <w:lang w:val="en-US" w:eastAsia="en-US" w:bidi="ar-SA"/>
-              </w:rPr>
-              <w:t>I also asked for help when needed and used feedback to improve my understanding of project structure and planning.</w:t>
-            </w:r>
-          </w:p>
-        </w:tc>
-      </w:tr>
-      <w:tr>
-        <w:trPr>
-          <w:trHeight w:val="268" w:hRule="atLeast"/>
-        </w:trPr>
-        <w:tc>
-          <w:tcPr>
-            <w:tcW w:w="2854" w:type="dxa"/>
-            <w:vMerge w:val="continue"/>
-            <w:tcBorders/>
-          </w:tcPr>
-          <w:p>
-            <w:pPr>
-              <w:pStyle w:val="NoSpacing"/>
-              <w:widowControl/>
-              <w:spacing w:before="0" w:after="0"/>
-              <w:jc w:val="start"/>
-              <w:rPr>
-                <w:rFonts w:ascii="Calibri" w:hAnsi="Calibri" w:eastAsia="Calibri" w:cs=""/>
-                <w:kern w:val="0"/>
-                <w:sz w:val="22"/>
-                <w:szCs w:val="22"/>
-                <w:lang w:val="en-US" w:eastAsia="en-US" w:bidi="ar-SA"/>
-              </w:rPr>
-            </w:pPr>
-            <w:r>
-              <w:rPr>
-                <w:rFonts w:eastAsia="Calibri" w:cs=""/>
-                <w:kern w:val="0"/>
-                <w:sz w:val="22"/>
-                <w:szCs w:val="22"/>
-                <w:lang w:val="en-US" w:eastAsia="en-US" w:bidi="ar-SA"/>
-              </w:rPr>
-            </w:r>
-          </w:p>
-        </w:tc>
-        <w:tc>
-          <w:tcPr>
-            <w:tcW w:w="856" w:type="dxa"/>
-            <w:vMerge w:val="continue"/>
-            <w:tcBorders/>
-          </w:tcPr>
-          <w:p>
-            <w:pPr>
-              <w:pStyle w:val="NoSpacing"/>
-              <w:widowControl/>
-              <w:spacing w:before="0" w:after="0"/>
-              <w:jc w:val="center"/>
-              <w:rPr>
-                <w:rFonts w:ascii="Calibri" w:hAnsi="Calibri" w:eastAsia="Calibri" w:cs=""/>
-                <w:kern w:val="0"/>
-                <w:sz w:val="22"/>
-                <w:szCs w:val="22"/>
-                <w:lang w:val="en-US" w:eastAsia="en-US" w:bidi="ar-SA"/>
-              </w:rPr>
-            </w:pPr>
-            <w:r>
-              <w:rPr>
-                <w:rFonts w:eastAsia="Calibri" w:cs=""/>
-                <w:kern w:val="0"/>
-                <w:sz w:val="22"/>
-                <w:szCs w:val="22"/>
-                <w:lang w:val="en-US" w:eastAsia="en-US" w:bidi="ar-SA"/>
-              </w:rPr>
-            </w:r>
-          </w:p>
-        </w:tc>
-        <w:tc>
-          <w:tcPr>
-            <w:tcW w:w="994" w:type="dxa"/>
-            <w:tcBorders/>
-          </w:tcPr>
-          <w:p>
-            <w:pPr>
-              <w:pStyle w:val="NoSpacing"/>
-              <w:widowControl/>
-              <w:spacing w:before="0" w:after="0"/>
-              <w:jc w:val="start"/>
-              <w:rPr>
-                <w:rFonts w:ascii="Calibri" w:hAnsi="Calibri" w:eastAsia="Calibri" w:cs=""/>
-                <w:kern w:val="0"/>
-                <w:sz w:val="22"/>
-                <w:szCs w:val="22"/>
-                <w:lang w:val="en-US" w:eastAsia="en-US" w:bidi="ar-SA"/>
-              </w:rPr>
-            </w:pPr>
-            <w:r>
-              <w:rPr>
-                <w:rFonts w:eastAsia="Calibri" w:cs=""/>
-                <w:kern w:val="0"/>
-                <w:sz w:val="22"/>
-                <w:szCs w:val="22"/>
-                <w:lang w:val="en-US" w:eastAsia="en-US" w:bidi="ar-SA"/>
-              </w:rPr>
-            </w:r>
-          </w:p>
-        </w:tc>
-        <w:tc>
-          <w:tcPr>
-            <w:tcW w:w="5106" w:type="dxa"/>
-            <w:tcBorders/>
-          </w:tcPr>
-          <w:p>
-            <w:pPr>
-              <w:pStyle w:val="NoSpacing"/>
-              <w:widowControl/>
-              <w:spacing w:before="0" w:after="0"/>
-              <w:jc w:val="start"/>
-              <w:rPr>
-                <w:rFonts w:ascii="Calibri" w:hAnsi="Calibri" w:eastAsia="Calibri" w:cs=""/>
-                <w:kern w:val="0"/>
-                <w:sz w:val="22"/>
-                <w:szCs w:val="22"/>
-                <w:lang w:val="en-US" w:eastAsia="en-US" w:bidi="ar-SA"/>
-              </w:rPr>
-            </w:pPr>
-            <w:r>
-              <w:rPr>
-                <w:rFonts w:eastAsia="Calibri" w:cs=""/>
-                <w:kern w:val="0"/>
-                <w:sz w:val="22"/>
-                <w:szCs w:val="22"/>
-                <w:lang w:val="en-US" w:eastAsia="en-US" w:bidi="ar-SA"/>
-              </w:rPr>
-            </w:r>
-          </w:p>
-        </w:tc>
-      </w:tr>
-      <w:tr>
-        <w:trPr>
-          <w:trHeight w:val="268" w:hRule="atLeast"/>
-        </w:trPr>
-        <w:tc>
-          <w:tcPr>
-            <w:tcW w:w="2854" w:type="dxa"/>
-            <w:vMerge w:val="restart"/>
-            <w:tcBorders/>
-          </w:tcPr>
-          <w:p>
-            <w:pPr>
-              <w:pStyle w:val="NoSpacing"/>
-              <w:widowControl/>
-              <w:spacing w:before="0" w:after="0"/>
-              <w:jc w:val="start"/>
-              <w:rPr>
-                <w:rFonts w:ascii="Calibri" w:hAnsi="Calibri" w:eastAsia="Calibri" w:cs=""/>
-                <w:kern w:val="0"/>
-                <w:sz w:val="22"/>
-                <w:szCs w:val="22"/>
-                <w:lang w:val="en-US" w:eastAsia="en-US" w:bidi="ar-SA"/>
-              </w:rPr>
-            </w:pPr>
-            <w:r>
-              <w:rPr>
-                <w:rFonts w:eastAsia="Calibri" w:cs=""/>
-                <w:kern w:val="0"/>
-                <w:sz w:val="22"/>
-                <w:szCs w:val="22"/>
-                <w:lang w:val="en-US" w:eastAsia="en-US" w:bidi="ar-SA"/>
-              </w:rPr>
-              <w:t>Use a divide and conquer approach to design solutions for programming problems.</w:t>
-            </w:r>
-          </w:p>
-        </w:tc>
-        <w:tc>
-          <w:tcPr>
-            <w:tcW w:w="856" w:type="dxa"/>
-            <w:vMerge w:val="restart"/>
-            <w:tcBorders/>
-          </w:tcPr>
-          <w:p>
-            <w:pPr>
-              <w:pStyle w:val="NoSpacing"/>
-              <w:widowControl/>
-              <w:spacing w:before="0" w:after="0"/>
-              <w:jc w:val="center"/>
-              <w:rPr>
-                <w:rFonts w:ascii="Calibri" w:hAnsi="Calibri" w:eastAsia="Calibri" w:cs=""/>
-                <w:kern w:val="0"/>
-                <w:sz w:val="22"/>
-                <w:szCs w:val="22"/>
-                <w:lang w:val="en-US" w:eastAsia="en-US" w:bidi="ar-SA"/>
-              </w:rPr>
-            </w:pPr>
-            <w:r>
-              <w:rPr>
-                <w:rFonts w:eastAsia="Calibri" w:cs=""/>
-                <w:kern w:val="0"/>
-                <w:sz w:val="22"/>
-                <w:szCs w:val="22"/>
-                <w:lang w:val="en-US" w:eastAsia="en-US" w:bidi="ar-SA"/>
-              </w:rPr>
-              <w:t>3</w:t>
-            </w:r>
-          </w:p>
-        </w:tc>
-        <w:tc>
-          <w:tcPr>
-            <w:tcW w:w="994" w:type="dxa"/>
-            <w:tcBorders/>
-          </w:tcPr>
-          <w:p>
-            <w:pPr>
-              <w:pStyle w:val="NoSpacing"/>
-              <w:widowControl/>
-              <w:spacing w:before="0" w:after="0"/>
-              <w:jc w:val="start"/>
-              <w:rPr>
-                <w:rFonts w:ascii="Calibri" w:hAnsi="Calibri" w:eastAsia="Calibri" w:cs=""/>
-                <w:kern w:val="0"/>
-                <w:sz w:val="22"/>
-                <w:szCs w:val="22"/>
-                <w:lang w:val="en-US" w:eastAsia="en-US" w:bidi="ar-SA"/>
-              </w:rPr>
-            </w:pPr>
-            <w:r>
-              <w:rPr>
-                <w:rFonts w:eastAsia="Calibri" w:cs=""/>
-                <w:kern w:val="0"/>
-                <w:sz w:val="22"/>
-                <w:szCs w:val="22"/>
-                <w:lang w:val="en-US" w:eastAsia="en-US" w:bidi="ar-SA"/>
-              </w:rPr>
-              <w:t>5</w:t>
-            </w:r>
-          </w:p>
-        </w:tc>
-        <w:tc>
-          <w:tcPr>
-            <w:tcW w:w="5106" w:type="dxa"/>
-            <w:tcBorders/>
-          </w:tcPr>
-          <w:p>
-            <w:pPr>
-              <w:pStyle w:val="NoSpacing"/>
-              <w:widowControl/>
-              <w:spacing w:before="0" w:after="0"/>
-              <w:jc w:val="start"/>
-              <w:rPr>
-                <w:rFonts w:ascii="Calibri" w:hAnsi="Calibri" w:eastAsia="Calibri" w:cs=""/>
-                <w:kern w:val="0"/>
-                <w:sz w:val="22"/>
-                <w:szCs w:val="22"/>
-                <w:lang w:val="en-US" w:eastAsia="en-US" w:bidi="ar-SA"/>
-              </w:rPr>
-            </w:pPr>
-            <w:r>
-              <w:rPr>
-                <w:rFonts w:eastAsia="Calibri" w:cs=""/>
-                <w:kern w:val="0"/>
-                <w:sz w:val="22"/>
-                <w:szCs w:val="22"/>
-                <w:lang w:val="en-US" w:eastAsia="en-US" w:bidi="ar-SA"/>
-              </w:rPr>
-              <w:t>I divided my application into multiple modules such as API handling, list rendering, detail views, and watchlist management. This made the project easier to manage and scale.</w:t>
-            </w:r>
-          </w:p>
-        </w:tc>
-      </w:tr>
-      <w:tr>
-        <w:trPr>
-          <w:trHeight w:val="268" w:hRule="atLeast"/>
-        </w:trPr>
-        <w:tc>
-          <w:tcPr>
-            <w:tcW w:w="2854" w:type="dxa"/>
-            <w:vMerge w:val="continue"/>
-            <w:tcBorders/>
-          </w:tcPr>
-          <w:p>
-            <w:pPr>
-              <w:pStyle w:val="NoSpacing"/>
-              <w:widowControl/>
-              <w:spacing w:before="0" w:after="0"/>
-              <w:jc w:val="start"/>
-              <w:rPr>
-                <w:rFonts w:ascii="Calibri" w:hAnsi="Calibri" w:eastAsia="Calibri" w:cs=""/>
-                <w:kern w:val="0"/>
-                <w:sz w:val="22"/>
-                <w:szCs w:val="22"/>
-                <w:lang w:val="en-US" w:eastAsia="en-US" w:bidi="ar-SA"/>
-              </w:rPr>
-            </w:pPr>
-            <w:r>
-              <w:rPr>
-                <w:rFonts w:eastAsia="Calibri" w:cs=""/>
-                <w:kern w:val="0"/>
-                <w:sz w:val="22"/>
-                <w:szCs w:val="22"/>
-                <w:lang w:val="en-US" w:eastAsia="en-US" w:bidi="ar-SA"/>
-              </w:rPr>
-            </w:r>
-          </w:p>
-        </w:tc>
-        <w:tc>
-          <w:tcPr>
-            <w:tcW w:w="856" w:type="dxa"/>
-            <w:vMerge w:val="continue"/>
-            <w:tcBorders/>
-          </w:tcPr>
-          <w:p>
-            <w:pPr>
-              <w:pStyle w:val="NoSpacing"/>
-              <w:widowControl/>
-              <w:spacing w:before="0" w:after="0"/>
-              <w:jc w:val="center"/>
-              <w:rPr>
-                <w:rFonts w:ascii="Calibri" w:hAnsi="Calibri" w:eastAsia="Calibri" w:cs=""/>
-                <w:kern w:val="0"/>
-                <w:sz w:val="22"/>
-                <w:szCs w:val="22"/>
-                <w:lang w:val="en-US" w:eastAsia="en-US" w:bidi="ar-SA"/>
-              </w:rPr>
-            </w:pPr>
-            <w:r>
-              <w:rPr>
-                <w:rFonts w:eastAsia="Calibri" w:cs=""/>
-                <w:kern w:val="0"/>
-                <w:sz w:val="22"/>
-                <w:szCs w:val="22"/>
-                <w:lang w:val="en-US" w:eastAsia="en-US" w:bidi="ar-SA"/>
-              </w:rPr>
-            </w:r>
-          </w:p>
-        </w:tc>
-        <w:tc>
-          <w:tcPr>
-            <w:tcW w:w="994" w:type="dxa"/>
-            <w:tcBorders/>
-          </w:tcPr>
-          <w:p>
-            <w:pPr>
-              <w:pStyle w:val="NoSpacing"/>
-              <w:widowControl/>
-              <w:spacing w:before="0" w:after="0"/>
-              <w:jc w:val="start"/>
-              <w:rPr>
-                <w:rFonts w:ascii="Calibri" w:hAnsi="Calibri" w:eastAsia="Calibri" w:cs=""/>
-                <w:kern w:val="0"/>
-                <w:sz w:val="22"/>
-                <w:szCs w:val="22"/>
-                <w:lang w:val="en-US" w:eastAsia="en-US" w:bidi="ar-SA"/>
-              </w:rPr>
-            </w:pPr>
-            <w:r>
-              <w:rPr>
-                <w:rFonts w:eastAsia="Calibri" w:cs=""/>
-                <w:kern w:val="0"/>
-                <w:sz w:val="22"/>
-                <w:szCs w:val="22"/>
-                <w:lang w:val="en-US" w:eastAsia="en-US" w:bidi="ar-SA"/>
-              </w:rPr>
-              <w:t>5</w:t>
-            </w:r>
-          </w:p>
-        </w:tc>
-        <w:tc>
-          <w:tcPr>
-            <w:tcW w:w="5106" w:type="dxa"/>
-            <w:tcBorders/>
-          </w:tcPr>
-          <w:p>
-            <w:pPr>
-              <w:pStyle w:val="NoSpacing"/>
-              <w:widowControl/>
-              <w:spacing w:before="0" w:after="0"/>
-              <w:jc w:val="start"/>
-              <w:rPr>
-                <w:rFonts w:ascii="Calibri" w:hAnsi="Calibri" w:eastAsia="Calibri" w:cs=""/>
-                <w:kern w:val="0"/>
-                <w:sz w:val="22"/>
-                <w:szCs w:val="22"/>
-                <w:lang w:val="en-US" w:eastAsia="en-US" w:bidi="ar-SA"/>
-              </w:rPr>
-            </w:pPr>
-            <w:r>
-              <w:rPr>
-                <w:rFonts w:eastAsia="Calibri" w:cs=""/>
-                <w:kern w:val="0"/>
-                <w:sz w:val="22"/>
-                <w:szCs w:val="22"/>
-                <w:lang w:val="en-US" w:eastAsia="en-US" w:bidi="ar-SA"/>
-              </w:rPr>
-              <w:t>I also broke down features into smaller tasks using Trello, which helped me organize development into manageable steps.</w:t>
-            </w:r>
-          </w:p>
-        </w:tc>
-      </w:tr>
-      <w:tr>
-        <w:trPr>
-          <w:trHeight w:val="268" w:hRule="atLeast"/>
-        </w:trPr>
-        <w:tc>
-          <w:tcPr>
-            <w:tcW w:w="2854" w:type="dxa"/>
-            <w:vMerge w:val="continue"/>
-            <w:tcBorders/>
-          </w:tcPr>
-          <w:p>
-            <w:pPr>
-              <w:pStyle w:val="NoSpacing"/>
-              <w:widowControl/>
-              <w:spacing w:before="0" w:after="0"/>
-              <w:jc w:val="start"/>
-              <w:rPr>
-                <w:rFonts w:ascii="Calibri" w:hAnsi="Calibri" w:eastAsia="Calibri" w:cs=""/>
-                <w:kern w:val="0"/>
-                <w:sz w:val="22"/>
-                <w:szCs w:val="22"/>
-                <w:lang w:val="en-US" w:eastAsia="en-US" w:bidi="ar-SA"/>
-              </w:rPr>
-            </w:pPr>
-            <w:r>
-              <w:rPr>
-                <w:rFonts w:eastAsia="Calibri" w:cs=""/>
-                <w:kern w:val="0"/>
-                <w:sz w:val="22"/>
-                <w:szCs w:val="22"/>
-                <w:lang w:val="en-US" w:eastAsia="en-US" w:bidi="ar-SA"/>
-              </w:rPr>
-            </w:r>
-          </w:p>
-        </w:tc>
-        <w:tc>
-          <w:tcPr>
-            <w:tcW w:w="856" w:type="dxa"/>
-            <w:vMerge w:val="continue"/>
-            <w:tcBorders/>
-          </w:tcPr>
-          <w:p>
-            <w:pPr>
-              <w:pStyle w:val="NoSpacing"/>
-              <w:widowControl/>
-              <w:spacing w:before="0" w:after="0"/>
-              <w:jc w:val="center"/>
-              <w:rPr>
-                <w:rFonts w:ascii="Calibri" w:hAnsi="Calibri" w:eastAsia="Calibri" w:cs=""/>
-                <w:kern w:val="0"/>
-                <w:sz w:val="22"/>
-                <w:szCs w:val="22"/>
-                <w:lang w:val="en-US" w:eastAsia="en-US" w:bidi="ar-SA"/>
-              </w:rPr>
-            </w:pPr>
-            <w:r>
-              <w:rPr>
-                <w:rFonts w:eastAsia="Calibri" w:cs=""/>
-                <w:kern w:val="0"/>
-                <w:sz w:val="22"/>
-                <w:szCs w:val="22"/>
-                <w:lang w:val="en-US" w:eastAsia="en-US" w:bidi="ar-SA"/>
-              </w:rPr>
-            </w:r>
-          </w:p>
-        </w:tc>
-        <w:tc>
-          <w:tcPr>
-            <w:tcW w:w="994" w:type="dxa"/>
-            <w:tcBorders/>
-          </w:tcPr>
-          <w:p>
-            <w:pPr>
-              <w:pStyle w:val="NoSpacing"/>
-              <w:widowControl/>
-              <w:spacing w:before="0" w:after="0"/>
-              <w:jc w:val="start"/>
-              <w:rPr>
-                <w:rFonts w:ascii="Calibri" w:hAnsi="Calibri" w:eastAsia="Calibri" w:cs=""/>
-                <w:kern w:val="0"/>
-                <w:sz w:val="22"/>
-                <w:szCs w:val="22"/>
-                <w:lang w:val="en-US" w:eastAsia="en-US" w:bidi="ar-SA"/>
-              </w:rPr>
-            </w:pPr>
-            <w:r>
-              <w:rPr>
-                <w:rFonts w:eastAsia="Calibri" w:cs=""/>
-                <w:kern w:val="0"/>
-                <w:sz w:val="22"/>
-                <w:szCs w:val="22"/>
-                <w:lang w:val="en-US" w:eastAsia="en-US" w:bidi="ar-SA"/>
-              </w:rPr>
-            </w:r>
-          </w:p>
-        </w:tc>
-        <w:tc>
-          <w:tcPr>
-            <w:tcW w:w="5106" w:type="dxa"/>
-            <w:tcBorders/>
-          </w:tcPr>
-          <w:p>
-            <w:pPr>
-              <w:pStyle w:val="NoSpacing"/>
-              <w:widowControl/>
-              <w:spacing w:before="0" w:after="0"/>
-              <w:jc w:val="start"/>
-              <w:rPr>
-                <w:rFonts w:ascii="Calibri" w:hAnsi="Calibri" w:eastAsia="Calibri" w:cs=""/>
-                <w:kern w:val="0"/>
-                <w:sz w:val="22"/>
-                <w:szCs w:val="22"/>
-                <w:lang w:val="en-US" w:eastAsia="en-US" w:bidi="ar-SA"/>
-              </w:rPr>
-            </w:pPr>
-            <w:r>
-              <w:rPr>
-                <w:rFonts w:eastAsia="Calibri" w:cs=""/>
-                <w:kern w:val="0"/>
-                <w:sz w:val="22"/>
-                <w:szCs w:val="22"/>
-                <w:lang w:val="en-US" w:eastAsia="en-US" w:bidi="ar-SA"/>
-              </w:rPr>
-            </w:r>
-          </w:p>
-        </w:tc>
-      </w:tr>
-      <w:tr>
-        <w:trPr>
-          <w:trHeight w:val="279" w:hRule="atLeast"/>
-        </w:trPr>
-        <w:tc>
-          <w:tcPr>
-            <w:tcW w:w="2854" w:type="dxa"/>
-            <w:vMerge w:val="restart"/>
-            <w:tcBorders/>
-          </w:tcPr>
-          <w:p>
-            <w:pPr>
-              <w:pStyle w:val="NoSpacing"/>
-              <w:widowControl/>
-              <w:spacing w:before="0" w:after="0"/>
-              <w:jc w:val="start"/>
-              <w:rPr>
-                <w:rFonts w:ascii="Calibri" w:hAnsi="Calibri" w:eastAsia="Calibri" w:cs=""/>
-                <w:kern w:val="0"/>
-                <w:sz w:val="22"/>
-                <w:szCs w:val="22"/>
-                <w:lang w:val="en-US" w:eastAsia="en-US" w:bidi="ar-SA"/>
-              </w:rPr>
-            </w:pPr>
-            <w:r>
-              <w:rPr>
-                <w:rFonts w:eastAsia="Calibri" w:cs=""/>
-                <w:kern w:val="0"/>
-                <w:sz w:val="22"/>
-                <w:szCs w:val="22"/>
-                <w:lang w:val="en-US" w:eastAsia="en-US" w:bidi="ar-SA"/>
-              </w:rPr>
-              <w:t>Finding and troubleshooting bugs you and others will have in the code you write.</w:t>
-            </w:r>
-          </w:p>
-        </w:tc>
-        <w:tc>
-          <w:tcPr>
-            <w:tcW w:w="856" w:type="dxa"/>
-            <w:vMerge w:val="restart"/>
-            <w:tcBorders/>
-          </w:tcPr>
-          <w:p>
-            <w:pPr>
-              <w:pStyle w:val="NoSpacing"/>
-              <w:widowControl/>
-              <w:spacing w:before="0" w:after="0"/>
-              <w:jc w:val="center"/>
-              <w:rPr>
-                <w:rFonts w:ascii="Calibri" w:hAnsi="Calibri" w:eastAsia="Calibri" w:cs=""/>
-                <w:kern w:val="0"/>
-                <w:sz w:val="22"/>
-                <w:szCs w:val="22"/>
-                <w:lang w:val="en-US" w:eastAsia="en-US" w:bidi="ar-SA"/>
-              </w:rPr>
-            </w:pPr>
-            <w:r>
-              <w:rPr>
-                <w:rFonts w:eastAsia="Calibri" w:cs=""/>
-                <w:kern w:val="0"/>
-                <w:sz w:val="22"/>
-                <w:szCs w:val="22"/>
-                <w:lang w:val="en-US" w:eastAsia="en-US" w:bidi="ar-SA"/>
-              </w:rPr>
-              <w:t>2</w:t>
-            </w:r>
-          </w:p>
-        </w:tc>
-        <w:tc>
-          <w:tcPr>
-            <w:tcW w:w="994" w:type="dxa"/>
-            <w:tcBorders/>
-          </w:tcPr>
-          <w:p>
-            <w:pPr>
-              <w:pStyle w:val="NoSpacing"/>
-              <w:widowControl/>
-              <w:spacing w:before="0" w:after="0"/>
-              <w:jc w:val="start"/>
-              <w:rPr>
-                <w:rFonts w:ascii="Calibri" w:hAnsi="Calibri" w:eastAsia="Calibri" w:cs=""/>
-                <w:kern w:val="0"/>
-                <w:sz w:val="22"/>
-                <w:szCs w:val="22"/>
-                <w:lang w:val="en-US" w:eastAsia="en-US" w:bidi="ar-SA"/>
-              </w:rPr>
-            </w:pPr>
-            <w:r>
-              <w:rPr>
-                <w:rFonts w:eastAsia="Calibri" w:cs=""/>
-                <w:kern w:val="0"/>
-                <w:sz w:val="22"/>
-                <w:szCs w:val="22"/>
-                <w:lang w:val="en-US" w:eastAsia="en-US" w:bidi="ar-SA"/>
-              </w:rPr>
-              <w:t>4</w:t>
-            </w:r>
-          </w:p>
-        </w:tc>
-        <w:tc>
-          <w:tcPr>
-            <w:tcW w:w="5106" w:type="dxa"/>
-            <w:tcBorders/>
-          </w:tcPr>
-          <w:p>
-            <w:pPr>
-              <w:pStyle w:val="NoSpacing"/>
-              <w:widowControl/>
-              <w:spacing w:before="0" w:after="0"/>
-              <w:jc w:val="start"/>
-              <w:rPr>
-                <w:rFonts w:ascii="Calibri" w:hAnsi="Calibri" w:eastAsia="Calibri" w:cs=""/>
-                <w:kern w:val="0"/>
-                <w:sz w:val="22"/>
-                <w:szCs w:val="22"/>
-                <w:lang w:val="en-US" w:eastAsia="en-US" w:bidi="ar-SA"/>
-              </w:rPr>
-            </w:pPr>
-            <w:r>
-              <w:rPr>
-                <w:rFonts w:eastAsia="Calibri" w:cs=""/>
-                <w:kern w:val="0"/>
-                <w:sz w:val="22"/>
-                <w:szCs w:val="22"/>
-                <w:lang w:val="en-US" w:eastAsia="en-US" w:bidi="ar-SA"/>
-              </w:rPr>
-              <w:t>I encountered issues using Git, especially when working with commits and repositories. I resolved these by practicing commands and helping others understand them as well.</w:t>
-            </w:r>
-          </w:p>
-        </w:tc>
-      </w:tr>
-      <w:tr>
-        <w:trPr>
-          <w:trHeight w:val="279" w:hRule="atLeast"/>
-        </w:trPr>
-        <w:tc>
-          <w:tcPr>
-            <w:tcW w:w="2854" w:type="dxa"/>
-            <w:vMerge w:val="continue"/>
-            <w:tcBorders/>
-          </w:tcPr>
-          <w:p>
-            <w:pPr>
-              <w:pStyle w:val="NoSpacing"/>
-              <w:widowControl/>
-              <w:spacing w:before="0" w:after="0"/>
-              <w:jc w:val="start"/>
-              <w:rPr>
-                <w:rFonts w:ascii="Calibri" w:hAnsi="Calibri" w:eastAsia="Calibri" w:cs=""/>
-                <w:kern w:val="0"/>
-                <w:sz w:val="22"/>
-                <w:szCs w:val="22"/>
-                <w:lang w:val="en-US" w:eastAsia="en-US" w:bidi="ar-SA"/>
-              </w:rPr>
-            </w:pPr>
-            <w:r>
-              <w:rPr>
-                <w:rFonts w:eastAsia="Calibri" w:cs=""/>
-                <w:kern w:val="0"/>
-                <w:sz w:val="22"/>
-                <w:szCs w:val="22"/>
-                <w:lang w:val="en-US" w:eastAsia="en-US" w:bidi="ar-SA"/>
-              </w:rPr>
-            </w:r>
-          </w:p>
-        </w:tc>
-        <w:tc>
-          <w:tcPr>
-            <w:tcW w:w="856" w:type="dxa"/>
-            <w:vMerge w:val="continue"/>
-            <w:tcBorders/>
-          </w:tcPr>
-          <w:p>
-            <w:pPr>
-              <w:pStyle w:val="NoSpacing"/>
-              <w:widowControl/>
-              <w:spacing w:before="0" w:after="0"/>
-              <w:jc w:val="start"/>
-              <w:rPr>
-                <w:rFonts w:ascii="Calibri" w:hAnsi="Calibri" w:eastAsia="Calibri" w:cs=""/>
-                <w:kern w:val="0"/>
-                <w:sz w:val="22"/>
-                <w:szCs w:val="22"/>
-                <w:lang w:val="en-US" w:eastAsia="en-US" w:bidi="ar-SA"/>
-              </w:rPr>
-            </w:pPr>
-            <w:r>
-              <w:rPr>
-                <w:rFonts w:eastAsia="Calibri" w:cs=""/>
-                <w:kern w:val="0"/>
-                <w:sz w:val="22"/>
-                <w:szCs w:val="22"/>
-                <w:lang w:val="en-US" w:eastAsia="en-US" w:bidi="ar-SA"/>
-              </w:rPr>
-            </w:r>
-          </w:p>
-        </w:tc>
-        <w:tc>
-          <w:tcPr>
-            <w:tcW w:w="994" w:type="dxa"/>
-            <w:tcBorders/>
-          </w:tcPr>
-          <w:p>
-            <w:pPr>
-              <w:pStyle w:val="NoSpacing"/>
-              <w:widowControl/>
-              <w:spacing w:before="0" w:after="0"/>
-              <w:jc w:val="start"/>
-              <w:rPr>
-                <w:rFonts w:ascii="Calibri" w:hAnsi="Calibri" w:eastAsia="Calibri" w:cs=""/>
-                <w:kern w:val="0"/>
-                <w:sz w:val="22"/>
-                <w:szCs w:val="22"/>
-                <w:lang w:val="en-US" w:eastAsia="en-US" w:bidi="ar-SA"/>
-              </w:rPr>
-            </w:pPr>
-            <w:r>
-              <w:rPr>
-                <w:rFonts w:eastAsia="Calibri" w:cs=""/>
-                <w:kern w:val="0"/>
-                <w:sz w:val="22"/>
-                <w:szCs w:val="22"/>
-                <w:lang w:val="en-US" w:eastAsia="en-US" w:bidi="ar-SA"/>
-              </w:rPr>
-              <w:t>5</w:t>
-            </w:r>
-          </w:p>
-        </w:tc>
-        <w:tc>
-          <w:tcPr>
-            <w:tcW w:w="5106" w:type="dxa"/>
-            <w:tcBorders/>
-          </w:tcPr>
-          <w:p>
-            <w:pPr>
-              <w:pStyle w:val="NoSpacing"/>
-              <w:widowControl/>
-              <w:spacing w:before="0" w:after="0"/>
-              <w:jc w:val="start"/>
-              <w:rPr>
-                <w:rFonts w:ascii="Calibri" w:hAnsi="Calibri" w:eastAsia="Calibri" w:cs=""/>
-                <w:kern w:val="0"/>
-                <w:sz w:val="22"/>
-                <w:szCs w:val="22"/>
-                <w:lang w:val="en-US" w:eastAsia="en-US" w:bidi="ar-SA"/>
-              </w:rPr>
-            </w:pPr>
-            <w:r>
-              <w:rPr>
-                <w:rFonts w:eastAsia="Calibri" w:cs=""/>
-                <w:kern w:val="0"/>
-                <w:sz w:val="22"/>
-                <w:szCs w:val="22"/>
-                <w:lang w:val="en-US" w:eastAsia="en-US" w:bidi="ar-SA"/>
-              </w:rPr>
-              <w:t>I used debugging techniques such as reviewing code, testing functionality step by step, and using console logs to understand issues.</w:t>
-            </w:r>
-          </w:p>
-        </w:tc>
-      </w:tr>
-      <w:tr>
-        <w:trPr>
-          <w:trHeight w:val="279" w:hRule="atLeast"/>
-        </w:trPr>
-        <w:tc>
-          <w:tcPr>
-            <w:tcW w:w="2854" w:type="dxa"/>
-            <w:vMerge w:val="continue"/>
-            <w:tcBorders/>
-          </w:tcPr>
-          <w:p>
-            <w:pPr>
-              <w:pStyle w:val="NoSpacing"/>
-              <w:widowControl/>
-              <w:spacing w:before="0" w:after="0"/>
-              <w:jc w:val="start"/>
-              <w:rPr>
-                <w:rFonts w:ascii="Calibri" w:hAnsi="Calibri" w:eastAsia="Calibri" w:cs=""/>
-                <w:kern w:val="0"/>
-                <w:sz w:val="22"/>
-                <w:szCs w:val="22"/>
-                <w:lang w:val="en-US" w:eastAsia="en-US" w:bidi="ar-SA"/>
-              </w:rPr>
-            </w:pPr>
-            <w:r>
-              <w:rPr>
-                <w:rFonts w:eastAsia="Calibri" w:cs=""/>
-                <w:kern w:val="0"/>
-                <w:sz w:val="22"/>
-                <w:szCs w:val="22"/>
-                <w:lang w:val="en-US" w:eastAsia="en-US" w:bidi="ar-SA"/>
-              </w:rPr>
-            </w:r>
-          </w:p>
-        </w:tc>
-        <w:tc>
-          <w:tcPr>
-            <w:tcW w:w="856" w:type="dxa"/>
-            <w:vMerge w:val="continue"/>
-            <w:tcBorders/>
-          </w:tcPr>
-          <w:p>
-            <w:pPr>
-              <w:pStyle w:val="NoSpacing"/>
-              <w:widowControl/>
-              <w:spacing w:before="0" w:after="0"/>
-              <w:jc w:val="start"/>
-              <w:rPr>
-                <w:rFonts w:ascii="Calibri" w:hAnsi="Calibri" w:eastAsia="Calibri" w:cs=""/>
-                <w:kern w:val="0"/>
-                <w:sz w:val="22"/>
-                <w:szCs w:val="22"/>
-                <w:lang w:val="en-US" w:eastAsia="en-US" w:bidi="ar-SA"/>
-              </w:rPr>
-            </w:pPr>
-            <w:r>
-              <w:rPr>
-                <w:rFonts w:eastAsia="Calibri" w:cs=""/>
-                <w:kern w:val="0"/>
-                <w:sz w:val="22"/>
-                <w:szCs w:val="22"/>
-                <w:lang w:val="en-US" w:eastAsia="en-US" w:bidi="ar-SA"/>
-              </w:rPr>
-            </w:r>
-          </w:p>
-        </w:tc>
-        <w:tc>
-          <w:tcPr>
-            <w:tcW w:w="994" w:type="dxa"/>
-            <w:tcBorders/>
-          </w:tcPr>
-          <w:p>
-            <w:pPr>
-              <w:pStyle w:val="NoSpacing"/>
-              <w:widowControl/>
-              <w:spacing w:before="0" w:after="0"/>
-              <w:jc w:val="start"/>
-              <w:rPr>
-                <w:rFonts w:ascii="Calibri" w:hAnsi="Calibri" w:eastAsia="Calibri" w:cs=""/>
-                <w:kern w:val="0"/>
-                <w:sz w:val="22"/>
-                <w:szCs w:val="22"/>
-                <w:lang w:val="en-US" w:eastAsia="en-US" w:bidi="ar-SA"/>
-              </w:rPr>
-            </w:pPr>
-            <w:r>
-              <w:rPr>
-                <w:rFonts w:eastAsia="Calibri" w:cs=""/>
-                <w:kern w:val="0"/>
-                <w:sz w:val="22"/>
-                <w:szCs w:val="22"/>
-                <w:lang w:val="en-US" w:eastAsia="en-US" w:bidi="ar-SA"/>
-              </w:rPr>
-            </w:r>
-          </w:p>
-        </w:tc>
-        <w:tc>
-          <w:tcPr>
-            <w:tcW w:w="5106" w:type="dxa"/>
-            <w:tcBorders/>
-          </w:tcPr>
-          <w:p>
-            <w:pPr>
-              <w:pStyle w:val="NoSpacing"/>
-              <w:widowControl/>
-              <w:spacing w:before="0" w:after="0"/>
-              <w:jc w:val="start"/>
-              <w:rPr>
-                <w:rFonts w:ascii="Calibri" w:hAnsi="Calibri" w:eastAsia="Calibri" w:cs=""/>
-                <w:kern w:val="0"/>
-                <w:sz w:val="22"/>
-                <w:szCs w:val="22"/>
-                <w:lang w:val="en-US" w:eastAsia="en-US" w:bidi="ar-SA"/>
-              </w:rPr>
-            </w:pPr>
-            <w:r>
-              <w:rPr>
-                <w:rFonts w:eastAsia="Calibri" w:cs=""/>
-                <w:kern w:val="0"/>
-                <w:sz w:val="22"/>
-                <w:szCs w:val="22"/>
-                <w:lang w:val="en-US" w:eastAsia="en-US" w:bidi="ar-SA"/>
-              </w:rPr>
+              <w:t>I also resolved issues related to Git and project structure by researching solutions and testing different approaches. Over time, I became more confident in identifying and fixing bugs efficiently in my code.</w:t>
             </w:r>
           </w:p>
         </w:tc>
@@ -4405,6 +3819,7 @@
     <w:qFormat/>
     <w:pPr>
       <w:widowControl/>
+      <w:suppressAutoHyphens w:val="true"/>
       <w:bidi w:val="0"/>
       <w:spacing w:lineRule="auto" w:line="259" w:before="0" w:after="160"/>
       <w:jc w:val="start"/>
@@ -4660,6 +4075,7 @@
     <w:rsid w:val="00e1426c"/>
     <w:pPr>
       <w:widowControl/>
+      <w:suppressAutoHyphens w:val="true"/>
       <w:bidi w:val="0"/>
       <w:spacing w:lineRule="auto" w:line="240" w:before="0" w:after="0"/>
       <w:jc w:val="start"/>
@@ -4685,6 +4101,29 @@
       <w:contextualSpacing/>
     </w:pPr>
     <w:rPr/>
+  </w:style>
+  <w:style w:type="paragraph" w:styleId="TableContents">
+    <w:name w:val="Table Contents"/>
+    <w:basedOn w:val="Normal"/>
+    <w:qFormat/>
+    <w:pPr>
+      <w:widowControl w:val="false"/>
+      <w:suppressLineNumbers/>
+    </w:pPr>
+    <w:rPr/>
+  </w:style>
+  <w:style w:type="paragraph" w:styleId="TableHeading">
+    <w:name w:val="Table Heading"/>
+    <w:basedOn w:val="TableContents"/>
+    <w:qFormat/>
+    <w:pPr>
+      <w:suppressLineNumbers/>
+      <w:jc w:val="center"/>
+    </w:pPr>
+    <w:rPr>
+      <w:b/>
+      <w:bCs/>
+    </w:rPr>
   </w:style>
   <w:style w:type="numbering" w:styleId="NoList" w:default="1">
     <w:name w:val="No List"/>

</xml_diff>